<commit_message>
docs: fix author name to Tidiane Cissé in PRD
Co-Authored-By: Claude Sonnet 4.6 <noreply@anthropic.com>
</commit_message>
<xml_diff>
--- a/docs/PRD_IDEA_copepod.docx
+++ b/docs/PRD_IDEA_copepod.docx
@@ -23,7 +23,7 @@
         <w:pStyle w:val="Author"/>
       </w:pPr>
       <w:r>
-        <w:t xml:space="preserve">Flinguee75</w:t>
+        <w:t xml:space="preserve">Tidiane Cissé</w:t>
       </w:r>
     </w:p>
     <w:p>
@@ -223,7 +223,7 @@
               <w:pStyle w:val="Compact"/>
             </w:pPr>
             <w:r>
-              <w:t xml:space="preserve">Flinguee75</w:t>
+              <w:t xml:space="preserve">Tidiane Cissé</w:t>
             </w:r>
           </w:p>
         </w:tc>
@@ -394,7 +394,7 @@
               <w:pStyle w:val="Compact"/>
             </w:pPr>
             <w:r>
-              <w:t xml:space="preserve">Flinguee75</w:t>
+              <w:t xml:space="preserve">Tidiane Cissé</w:t>
             </w:r>
           </w:p>
         </w:tc>
@@ -440,7 +440,7 @@
               <w:pStyle w:val="Compact"/>
             </w:pPr>
             <w:r>
-              <w:t xml:space="preserve">Flinguee75</w:t>
+              <w:t xml:space="preserve">Tidiane Cissé</w:t>
             </w:r>
           </w:p>
         </w:tc>
@@ -486,7 +486,7 @@
               <w:pStyle w:val="Compact"/>
             </w:pPr>
             <w:r>
-              <w:t xml:space="preserve">Flinguee75</w:t>
+              <w:t xml:space="preserve">Tidiane Cissé</w:t>
             </w:r>
           </w:p>
         </w:tc>
@@ -532,7 +532,7 @@
               <w:pStyle w:val="Compact"/>
             </w:pPr>
             <w:r>
-              <w:t xml:space="preserve">Flinguee75</w:t>
+              <w:t xml:space="preserve">Tidiane Cissé</w:t>
             </w:r>
           </w:p>
         </w:tc>

</xml_diff>

<commit_message>
docs: consolidate PRD to single DOCX with diagrams
Remove text-only version, rename diagrams version as the canonical
PRD_IDEA_copepod.docx — always the latest with rendered diagrams.

Co-Authored-By: Claude Sonnet 4.6 <noreply@anthropic.com>
</commit_message>
<xml_diff>
--- a/docs/PRD_IDEA_copepod.docx
+++ b/docs/PRD_IDEA_copepod.docx
@@ -1408,7 +1408,7 @@
     </w:p>
     <w:bookmarkEnd w:id="15"/>
     <w:bookmarkEnd w:id="16"/>
-    <w:bookmarkStart w:id="21" w:name="solution"/>
+    <w:bookmarkStart w:id="30" w:name="solution"/>
     <w:p>
       <w:pPr>
         <w:pStyle w:val="Heading1"/>
@@ -1475,7 +1475,7 @@
       </w:r>
     </w:p>
     <w:bookmarkEnd w:id="17"/>
-    <w:bookmarkStart w:id="18" w:name="architecture-générale"/>
+    <w:bookmarkStart w:id="21" w:name="architecture-générale"/>
     <w:p>
       <w:pPr>
         <w:pStyle w:val="Heading2"/>
@@ -1486,101 +1486,53 @@
     </w:p>
     <w:p>
       <w:pPr>
-        <w:pStyle w:val="SourceCode"/>
-      </w:pPr>
-      <w:r>
-        <w:rPr>
-          <w:rStyle w:val="VerbatimChar"/>
-        </w:rPr>
-        <w:t xml:space="preserve">graph TD</w:t>
-      </w:r>
-      <w:r>
-        <w:br/>
-      </w:r>
-      <w:r>
-        <w:rPr>
-          <w:rStyle w:val="VerbatimChar"/>
-        </w:rPr>
-        <w:t xml:space="preserve">    U[Utilisateur] --&gt;|discussion guidée| MC[Mode Contexte\nPlanification graphique]</w:t>
-      </w:r>
-      <w:r>
-        <w:br/>
-      </w:r>
-      <w:r>
-        <w:rPr>
-          <w:rStyle w:val="VerbatimChar"/>
-        </w:rPr>
-        <w:t xml:space="preserve">    MC --&gt;|contexte validé| MA[Mode Analyse\nFormulaire structuré]</w:t>
-      </w:r>
-      <w:r>
-        <w:br/>
-      </w:r>
-      <w:r>
-        <w:rPr>
-          <w:rStyle w:val="VerbatimChar"/>
-        </w:rPr>
-        <w:t xml:space="preserve">    MA --&gt;|validation params| GP[Plan graphique verrouillé\nespèce · colonnes · filtres · format]</w:t>
-      </w:r>
-      <w:r>
-        <w:br/>
-      </w:r>
-      <w:r>
-        <w:rPr>
-          <w:rStyle w:val="VerbatimChar"/>
-        </w:rPr>
-        <w:t xml:space="preserve">    GP --&gt;|plan validé| GEN[Génération graphique\nPython ou R]</w:t>
-      </w:r>
-      <w:r>
-        <w:br/>
-      </w:r>
-      <w:r>
-        <w:rPr>
-          <w:rStyle w:val="VerbatimChar"/>
-        </w:rPr>
-        <w:t xml:space="preserve">    GEN --&gt; ART[Artefact statique\nPNG ou SVG]</w:t>
-      </w:r>
-      <w:r>
-        <w:br/>
-      </w:r>
-      <w:r>
-        <w:rPr>
-          <w:rStyle w:val="VerbatimChar"/>
-        </w:rPr>
-        <w:t xml:space="preserve">    GEN --&gt; META[Métadonnées\nsource · colonnes · filtres · unités · limites]</w:t>
-      </w:r>
-      <w:r>
-        <w:br/>
-      </w:r>
-      <w:r>
-        <w:rPr>
-          <w:rStyle w:val="VerbatimChar"/>
-        </w:rPr>
-        <w:t xml:space="preserve">    ART --&gt; LIV[Livrable\ncontexte · figures · méthodes · citations · limites]</w:t>
-      </w:r>
-      <w:r>
-        <w:br/>
-      </w:r>
-      <w:r>
-        <w:br/>
-      </w:r>
-      <w:r>
-        <w:rPr>
-          <w:rStyle w:val="VerbatimChar"/>
-        </w:rPr>
-        <w:t xml:space="preserve">    MA --&gt;|active| SRC[Sources\nEcoTaxa · EcoPart · Amundsen CTD\nOGSL · Bio-ORACLE · Fichier labo]</w:t>
-      </w:r>
-      <w:r>
-        <w:br/>
-      </w:r>
-      <w:r>
-        <w:rPr>
-          <w:rStyle w:val="VerbatimChar"/>
-        </w:rPr>
-        <w:t xml:space="preserve">    GP --&gt;|consulte| RAG[Corpus RAG\ncolonnes_sources · colonnes_instruments\ncopepodes_domaine · methodes_calcul\nsources_en_ligne]</w:t>
-      </w:r>
-    </w:p>
-    <w:bookmarkEnd w:id="18"/>
-    <w:bookmarkStart w:id="19" w:name="cycle-de-vie-dune-session"/>
+        <w:pStyle w:val="FirstParagraph"/>
+      </w:pPr>
+      <w:r>
+        <w:drawing>
+          <wp:inline>
+            <wp:extent cx="5334000" cy="4592410"/>
+            <wp:effectExtent b="0" l="0" r="0" t="0"/>
+            <wp:docPr descr="" title="" id="19" name="Picture"/>
+            <a:graphic>
+              <a:graphicData uri="http://schemas.openxmlformats.org/drawingml/2006/picture">
+                <pic:pic>
+                  <pic:nvPicPr>
+                    <pic:cNvPr descr="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" id="20" name="Picture"/>
+                    <pic:cNvPicPr>
+                      <a:picLocks noChangeArrowheads="1" noChangeAspect="1"/>
+                    </pic:cNvPicPr>
+                  </pic:nvPicPr>
+                  <pic:blipFill>
+                    <a:blip r:embed="rId18"/>
+                    <a:stretch>
+                      <a:fillRect/>
+                    </a:stretch>
+                  </pic:blipFill>
+                  <pic:spPr bwMode="auto">
+                    <a:xfrm>
+                      <a:off x="0" y="0"/>
+                      <a:ext cx="5334000" cy="4592410"/>
+                    </a:xfrm>
+                    <a:prstGeom prst="rect">
+                      <a:avLst/>
+                    </a:prstGeom>
+                    <a:noFill/>
+                    <a:ln w="9525">
+                      <a:noFill/>
+                      <a:headEnd/>
+                      <a:tailEnd/>
+                    </a:ln>
+                  </pic:spPr>
+                </pic:pic>
+              </a:graphicData>
+            </a:graphic>
+          </wp:inline>
+        </w:drawing>
+      </w:r>
+    </w:p>
+    <w:bookmarkEnd w:id="21"/>
+    <w:bookmarkStart w:id="25" w:name="cycle-de-vie-dune-session"/>
     <w:p>
       <w:pPr>
         <w:pStyle w:val="Heading2"/>
@@ -1599,185 +1551,53 @@
     </w:p>
     <w:p>
       <w:pPr>
-        <w:pStyle w:val="SourceCode"/>
-      </w:pPr>
-      <w:r>
-        <w:rPr>
-          <w:rStyle w:val="VerbatimChar"/>
-        </w:rPr>
-        <w:t xml:space="preserve">graph TD</w:t>
-      </w:r>
-      <w:r>
-        <w:br/>
-      </w:r>
-      <w:r>
-        <w:rPr>
-          <w:rStyle w:val="VerbatimChar"/>
-        </w:rPr>
-        <w:t xml:space="preserve">    U([Utilisateur]) --&gt;|décrit son besoin| CTX[Planification\ndu contexte graphique]</w:t>
-      </w:r>
-      <w:r>
-        <w:br/>
-      </w:r>
-      <w:r>
-        <w:br/>
-      </w:r>
-      <w:r>
-        <w:rPr>
-          <w:rStyle w:val="VerbatimChar"/>
-        </w:rPr>
-        <w:t xml:space="preserve">    CTX --&gt;|contexte incomplet| BLOCK1[Blocage\nl'assistant pose la question manquante]</w:t>
-      </w:r>
-      <w:r>
-        <w:br/>
-      </w:r>
-      <w:r>
-        <w:rPr>
-          <w:rStyle w:val="VerbatimChar"/>
-        </w:rPr>
-        <w:t xml:space="preserve">    BLOCK1 --&gt;|utilisateur complète| CTX</w:t>
-      </w:r>
-      <w:r>
-        <w:br/>
-      </w:r>
-      <w:r>
-        <w:br/>
-      </w:r>
-      <w:r>
-        <w:rPr>
-          <w:rStyle w:val="VerbatimChar"/>
-        </w:rPr>
-        <w:t xml:space="preserve">    CTX --&gt;|contexte validé| DATA{Source des données ?}</w:t>
-      </w:r>
-      <w:r>
-        <w:br/>
-      </w:r>
-      <w:r>
-        <w:rPr>
-          <w:rStyle w:val="VerbatimChar"/>
-        </w:rPr>
-        <w:t xml:space="preserve">    DATA --&gt;|fichier déjà chargé| INSP[Inspection des colonnes\net validation]</w:t>
-      </w:r>
-      <w:r>
-        <w:br/>
-      </w:r>
-      <w:r>
-        <w:rPr>
-          <w:rStyle w:val="VerbatimChar"/>
-        </w:rPr>
-        <w:t xml:space="preserve">    DATA --&gt;|source en ligne| ONLINE[Mode En Ligne\nactivé par source]</w:t>
-      </w:r>
-      <w:r>
-        <w:br/>
-      </w:r>
-      <w:r>
-        <w:rPr>
-          <w:rStyle w:val="VerbatimChar"/>
-        </w:rPr>
-        <w:t xml:space="preserve">    ONLINE --&gt; INSP</w:t>
-      </w:r>
-      <w:r>
-        <w:br/>
-      </w:r>
-      <w:r>
-        <w:br/>
-      </w:r>
-      <w:r>
-        <w:rPr>
-          <w:rStyle w:val="VerbatimChar"/>
-        </w:rPr>
-        <w:t xml:space="preserve">    INSP --&gt;|colonnes suffisantes| PLAN[Plan graphique verrouillé]</w:t>
-      </w:r>
-      <w:r>
-        <w:br/>
-      </w:r>
-      <w:r>
-        <w:rPr>
-          <w:rStyle w:val="VerbatimChar"/>
-        </w:rPr>
-        <w:t xml:space="preserve">    INSP --&gt;|colonne manquante| BLOCK2[Blocage explicite\nce qui manque · action à faire]</w:t>
-      </w:r>
-      <w:r>
-        <w:br/>
-      </w:r>
-      <w:r>
-        <w:rPr>
-          <w:rStyle w:val="VerbatimChar"/>
-        </w:rPr>
-        <w:t xml:space="preserve">    BLOCK2 --&gt;|utilisateur agit| INSP</w:t>
-      </w:r>
-      <w:r>
-        <w:br/>
-      </w:r>
-      <w:r>
-        <w:br/>
-      </w:r>
-      <w:r>
-        <w:rPr>
-          <w:rStyle w:val="VerbatimChar"/>
-        </w:rPr>
-        <w:t xml:space="preserve">    PLAN --&gt; GEN[Génération\nPython ou R]</w:t>
-      </w:r>
-      <w:r>
-        <w:br/>
-      </w:r>
-      <w:r>
-        <w:rPr>
-          <w:rStyle w:val="VerbatimChar"/>
-        </w:rPr>
-        <w:t xml:space="preserve">    GEN --&gt;|erreur| FIX[Correction automatique\net relance]</w:t>
-      </w:r>
-      <w:r>
-        <w:br/>
-      </w:r>
-      <w:r>
-        <w:rPr>
-          <w:rStyle w:val="VerbatimChar"/>
-        </w:rPr>
-        <w:t xml:space="preserve">    FIX --&gt; GEN</w:t>
-      </w:r>
-      <w:r>
-        <w:br/>
-      </w:r>
-      <w:r>
-        <w:rPr>
-          <w:rStyle w:val="VerbatimChar"/>
-        </w:rPr>
-        <w:t xml:space="preserve">    GEN --&gt; ART[Graphique produit\nPNG ou SVG + métadonnées]</w:t>
-      </w:r>
-      <w:r>
-        <w:br/>
-      </w:r>
-      <w:r>
-        <w:rPr>
-          <w:rStyle w:val="VerbatimChar"/>
-        </w:rPr>
-        <w:t xml:space="preserve">    ART --&gt; U</w:t>
-      </w:r>
-      <w:r>
-        <w:br/>
-      </w:r>
-      <w:r>
-        <w:br/>
-      </w:r>
-      <w:r>
-        <w:rPr>
-          <w:rStyle w:val="VerbatimChar"/>
-        </w:rPr>
-        <w:t xml:space="preserve">    U --&gt;|demande interprétation| REFUSE[Refus\nl'assistant rappelle son périmètre]</w:t>
-      </w:r>
-      <w:r>
-        <w:br/>
-      </w:r>
-      <w:r>
-        <w:rPr>
-          <w:rStyle w:val="VerbatimChar"/>
-        </w:rPr>
-        <w:t xml:space="preserve">    REFUSE --&gt; U</w:t>
-      </w:r>
-    </w:p>
-    <w:bookmarkEnd w:id="19"/>
-    <w:bookmarkStart w:id="20" w:name="états-de-la-session"/>
+        <w:pStyle w:val="BodyText"/>
+      </w:pPr>
+      <w:r>
+        <w:drawing>
+          <wp:inline>
+            <wp:extent cx="5334000" cy="6252482"/>
+            <wp:effectExtent b="0" l="0" r="0" t="0"/>
+            <wp:docPr descr="" title="" id="23" name="Picture"/>
+            <a:graphic>
+              <a:graphicData uri="http://schemas.openxmlformats.org/drawingml/2006/picture">
+                <pic:pic>
+                  <pic:nvPicPr>
+                    <pic:cNvPr descr="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" id="24" name="Picture"/>
+                    <pic:cNvPicPr>
+                      <a:picLocks noChangeArrowheads="1" noChangeAspect="1"/>
+                    </pic:cNvPicPr>
+                  </pic:nvPicPr>
+                  <pic:blipFill>
+                    <a:blip r:embed="rId22"/>
+                    <a:stretch>
+                      <a:fillRect/>
+                    </a:stretch>
+                  </pic:blipFill>
+                  <pic:spPr bwMode="auto">
+                    <a:xfrm>
+                      <a:off x="0" y="0"/>
+                      <a:ext cx="5334000" cy="6252482"/>
+                    </a:xfrm>
+                    <a:prstGeom prst="rect">
+                      <a:avLst/>
+                    </a:prstGeom>
+                    <a:noFill/>
+                    <a:ln w="9525">
+                      <a:noFill/>
+                      <a:headEnd/>
+                      <a:tailEnd/>
+                    </a:ln>
+                  </pic:spPr>
+                </pic:pic>
+              </a:graphicData>
+            </a:graphic>
+          </wp:inline>
+        </w:drawing>
+      </w:r>
+    </w:p>
+    <w:bookmarkEnd w:id="25"/>
+    <w:bookmarkStart w:id="29" w:name="états-de-la-session"/>
     <w:p>
       <w:pPr>
         <w:pStyle w:val="Heading2"/>
@@ -1788,223 +1608,49 @@
     </w:p>
     <w:p>
       <w:pPr>
-        <w:pStyle w:val="SourceCode"/>
-      </w:pPr>
-      <w:r>
-        <w:rPr>
-          <w:rStyle w:val="VerbatimChar"/>
-        </w:rPr>
-        <w:t xml:space="preserve">stateDiagram-v2</w:t>
-      </w:r>
-      <w:r>
-        <w:br/>
-      </w:r>
-      <w:r>
-        <w:rPr>
-          <w:rStyle w:val="VerbatimChar"/>
-        </w:rPr>
-        <w:t xml:space="preserve">    [*] --&gt; DonneesLocales : session démarrée</w:t>
-      </w:r>
-      <w:r>
-        <w:br/>
-      </w:r>
-      <w:r>
-        <w:br/>
-      </w:r>
-      <w:r>
-        <w:rPr>
-          <w:rStyle w:val="VerbatimChar"/>
-        </w:rPr>
-        <w:t xml:space="preserve">    DonneesLocales --&gt; PlanificationGraphique : utilisateur décrit le graphique souhaité</w:t>
-      </w:r>
-      <w:r>
-        <w:br/>
-      </w:r>
-      <w:r>
-        <w:rPr>
-          <w:rStyle w:val="VerbatimChar"/>
-        </w:rPr>
-        <w:t xml:space="preserve">    DonneesLocales --&gt; ModeEnLigne : utilisateur active une source externe</w:t>
-      </w:r>
-      <w:r>
-        <w:br/>
-      </w:r>
-      <w:r>
-        <w:br/>
-      </w:r>
-      <w:r>
-        <w:rPr>
-          <w:rStyle w:val="VerbatimChar"/>
-        </w:rPr>
-        <w:t xml:space="preserve">    ModeEnLigne --&gt; PlanificationGraphique : données récupérées et disponibles</w:t>
-      </w:r>
-      <w:r>
-        <w:br/>
-      </w:r>
-      <w:r>
-        <w:br/>
-      </w:r>
-      <w:r>
-        <w:rPr>
-          <w:rStyle w:val="VerbatimChar"/>
-        </w:rPr>
-        <w:t xml:space="preserve">    PlanificationGraphique --&gt; Bloque : paramètre manquant ou colonne absente</w:t>
-      </w:r>
-      <w:r>
-        <w:br/>
-      </w:r>
-      <w:r>
-        <w:rPr>
-          <w:rStyle w:val="VerbatimChar"/>
-        </w:rPr>
-        <w:t xml:space="preserve">    Bloque --&gt; PlanificationGraphique : utilisateur fournit l'information manquante</w:t>
-      </w:r>
-      <w:r>
-        <w:br/>
-      </w:r>
-      <w:r>
-        <w:br/>
-      </w:r>
-      <w:r>
-        <w:rPr>
-          <w:rStyle w:val="VerbatimChar"/>
-        </w:rPr>
-        <w:t xml:space="preserve">    PlanificationGraphique --&gt; Generation : contexte et colonnes validés</w:t>
-      </w:r>
-      <w:r>
-        <w:br/>
-      </w:r>
-      <w:r>
-        <w:rPr>
-          <w:rStyle w:val="VerbatimChar"/>
-        </w:rPr>
-        <w:t xml:space="preserve">    Generation --&gt; Bloque : colonne manquante détectée à la génération</w:t>
-      </w:r>
-      <w:r>
-        <w:br/>
-      </w:r>
-      <w:r>
-        <w:br/>
-      </w:r>
-      <w:r>
-        <w:rPr>
-          <w:rStyle w:val="VerbatimChar"/>
-        </w:rPr>
-        <w:t xml:space="preserve">    Generation --&gt; GraphiqueProduit : graphique généré avec succès</w:t>
-      </w:r>
-      <w:r>
-        <w:br/>
-      </w:r>
-      <w:r>
-        <w:rPr>
-          <w:rStyle w:val="VerbatimChar"/>
-        </w:rPr>
-        <w:t xml:space="preserve">    GraphiqueProduit --&gt; DonneesLocales : nouvelle demande</w:t>
-      </w:r>
-      <w:r>
-        <w:br/>
-      </w:r>
-      <w:r>
-        <w:rPr>
-          <w:rStyle w:val="VerbatimChar"/>
-        </w:rPr>
-        <w:t xml:space="preserve">    GraphiqueProduit --&gt; [*] : session terminée</w:t>
-      </w:r>
-      <w:r>
-        <w:br/>
-      </w:r>
-      <w:r>
-        <w:br/>
-      </w:r>
-      <w:r>
-        <w:rPr>
-          <w:rStyle w:val="VerbatimChar"/>
-        </w:rPr>
-        <w:t xml:space="preserve">    note right of DonneesLocales</w:t>
-      </w:r>
-      <w:r>
-        <w:br/>
-      </w:r>
-      <w:r>
-        <w:rPr>
-          <w:rStyle w:val="VerbatimChar"/>
-        </w:rPr>
-        <w:t xml:space="preserve">        L'assistant travaille avec</w:t>
-      </w:r>
-      <w:r>
-        <w:br/>
-      </w:r>
-      <w:r>
-        <w:rPr>
-          <w:rStyle w:val="VerbatimChar"/>
-        </w:rPr>
-        <w:t xml:space="preserve">        les fichiers déjà chargés</w:t>
-      </w:r>
-      <w:r>
-        <w:br/>
-      </w:r>
-      <w:r>
-        <w:rPr>
-          <w:rStyle w:val="VerbatimChar"/>
-        </w:rPr>
-        <w:t xml:space="preserve">        et le corpus documentaire local.</w:t>
-      </w:r>
-      <w:r>
-        <w:br/>
-      </w:r>
-      <w:r>
-        <w:rPr>
-          <w:rStyle w:val="VerbatimChar"/>
-        </w:rPr>
-        <w:t xml:space="preserve">    end note</w:t>
-      </w:r>
-      <w:r>
-        <w:br/>
-      </w:r>
-      <w:r>
-        <w:br/>
-      </w:r>
-      <w:r>
-        <w:rPr>
-          <w:rStyle w:val="VerbatimChar"/>
-        </w:rPr>
-        <w:t xml:space="preserve">    note right of Bloque</w:t>
-      </w:r>
-      <w:r>
-        <w:br/>
-      </w:r>
-      <w:r>
-        <w:rPr>
-          <w:rStyle w:val="VerbatimChar"/>
-        </w:rPr>
-        <w:t xml:space="preserve">        L'assistant explique toujours</w:t>
-      </w:r>
-      <w:r>
-        <w:br/>
-      </w:r>
-      <w:r>
-        <w:rPr>
-          <w:rStyle w:val="VerbatimChar"/>
-        </w:rPr>
-        <w:t xml:space="preserve">        ce qui bloque et ce qu'il</w:t>
-      </w:r>
-      <w:r>
-        <w:br/>
-      </w:r>
-      <w:r>
-        <w:rPr>
-          <w:rStyle w:val="VerbatimChar"/>
-        </w:rPr>
-        <w:t xml:space="preserve">        faut faire pour débloquer.</w:t>
-      </w:r>
-      <w:r>
-        <w:br/>
-      </w:r>
-      <w:r>
-        <w:rPr>
-          <w:rStyle w:val="VerbatimChar"/>
-        </w:rPr>
-        <w:t xml:space="preserve">    end note</w:t>
+        <w:pStyle w:val="FirstParagraph"/>
+      </w:pPr>
+      <w:r>
+        <w:drawing>
+          <wp:inline>
+            <wp:extent cx="5334000" cy="3619500"/>
+            <wp:effectExtent b="0" l="0" r="0" t="0"/>
+            <wp:docPr descr="" title="" id="27" name="Picture"/>
+            <a:graphic>
+              <a:graphicData uri="http://schemas.openxmlformats.org/drawingml/2006/picture">
+                <pic:pic>
+                  <pic:nvPicPr>
+                    <pic:cNvPr descr="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" id="28" name="Picture"/>
+                    <pic:cNvPicPr>
+                      <a:picLocks noChangeArrowheads="1" noChangeAspect="1"/>
+                    </pic:cNvPicPr>
+                  </pic:nvPicPr>
+                  <pic:blipFill>
+                    <a:blip r:embed="rId26"/>
+                    <a:stretch>
+                      <a:fillRect/>
+                    </a:stretch>
+                  </pic:blipFill>
+                  <pic:spPr bwMode="auto">
+                    <a:xfrm>
+                      <a:off x="0" y="0"/>
+                      <a:ext cx="5334000" cy="3619500"/>
+                    </a:xfrm>
+                    <a:prstGeom prst="rect">
+                      <a:avLst/>
+                    </a:prstGeom>
+                    <a:noFill/>
+                    <a:ln w="9525">
+                      <a:noFill/>
+                      <a:headEnd/>
+                      <a:tailEnd/>
+                    </a:ln>
+                  </pic:spPr>
+                </pic:pic>
+              </a:graphicData>
+            </a:graphic>
+          </wp:inline>
+        </w:drawing>
       </w:r>
     </w:p>
     <w:p>
@@ -2014,9 +1660,9 @@
         </w:pict>
       </w:r>
     </w:p>
-    <w:bookmarkEnd w:id="20"/>
-    <w:bookmarkEnd w:id="21"/>
-    <w:bookmarkStart w:id="24" w:name="utilisateurs"/>
+    <w:bookmarkEnd w:id="29"/>
+    <w:bookmarkEnd w:id="30"/>
+    <w:bookmarkStart w:id="36" w:name="utilisateurs"/>
     <w:p>
       <w:pPr>
         <w:pStyle w:val="Heading1"/>
@@ -2025,7 +1671,7 @@
         <w:t xml:space="preserve">3. Utilisateurs</w:t>
       </w:r>
     </w:p>
-    <w:bookmarkStart w:id="22" w:name="acteurs"/>
+    <w:bookmarkStart w:id="34" w:name="acteurs"/>
     <w:p>
       <w:pPr>
         <w:pStyle w:val="Heading2"/>
@@ -2036,35 +1682,53 @@
     </w:p>
     <w:p>
       <w:pPr>
-        <w:pStyle w:val="SourceCode"/>
-      </w:pPr>
-      <w:r>
-        <w:rPr>
-          <w:rStyle w:val="VerbatimChar"/>
-        </w:rPr>
-        <w:t xml:space="preserve">graph LR</w:t>
-      </w:r>
-      <w:r>
-        <w:br/>
-      </w:r>
-      <w:r>
-        <w:rPr>
-          <w:rStyle w:val="VerbatimChar"/>
-        </w:rPr>
-        <w:t xml:space="preserve">    P[Professeur] --&gt;|toutes les fonctions| A[Assistant graphique\ncopépodes]</w:t>
-      </w:r>
-      <w:r>
-        <w:br/>
-      </w:r>
-      <w:r>
-        <w:rPr>
-          <w:rStyle w:val="VerbatimChar"/>
-        </w:rPr>
-        <w:t xml:space="preserve">    E[Etudiant] --&gt;|fonctions de base| A</w:t>
-      </w:r>
-    </w:p>
-    <w:bookmarkEnd w:id="22"/>
-    <w:bookmarkStart w:id="23" w:name="droits-par-acteur"/>
+        <w:pStyle w:val="FirstParagraph"/>
+      </w:pPr>
+      <w:r>
+        <w:drawing>
+          <wp:inline>
+            <wp:extent cx="5334000" cy="1584824"/>
+            <wp:effectExtent b="0" l="0" r="0" t="0"/>
+            <wp:docPr descr="" title="" id="32" name="Picture"/>
+            <a:graphic>
+              <a:graphicData uri="http://schemas.openxmlformats.org/drawingml/2006/picture">
+                <pic:pic>
+                  <pic:nvPicPr>
+                    <pic:cNvPr descr="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" id="33" name="Picture"/>
+                    <pic:cNvPicPr>
+                      <a:picLocks noChangeArrowheads="1" noChangeAspect="1"/>
+                    </pic:cNvPicPr>
+                  </pic:nvPicPr>
+                  <pic:blipFill>
+                    <a:blip r:embed="rId31"/>
+                    <a:stretch>
+                      <a:fillRect/>
+                    </a:stretch>
+                  </pic:blipFill>
+                  <pic:spPr bwMode="auto">
+                    <a:xfrm>
+                      <a:off x="0" y="0"/>
+                      <a:ext cx="5334000" cy="1584824"/>
+                    </a:xfrm>
+                    <a:prstGeom prst="rect">
+                      <a:avLst/>
+                    </a:prstGeom>
+                    <a:noFill/>
+                    <a:ln w="9525">
+                      <a:noFill/>
+                      <a:headEnd/>
+                      <a:tailEnd/>
+                    </a:ln>
+                  </pic:spPr>
+                </pic:pic>
+              </a:graphicData>
+            </a:graphic>
+          </wp:inline>
+        </w:drawing>
+      </w:r>
+    </w:p>
+    <w:bookmarkEnd w:id="34"/>
+    <w:bookmarkStart w:id="35" w:name="droits-par-acteur"/>
     <w:p>
       <w:pPr>
         <w:pStyle w:val="Heading2"/>
@@ -2465,9 +2129,9 @@
         </w:pict>
       </w:r>
     </w:p>
-    <w:bookmarkEnd w:id="23"/>
-    <w:bookmarkEnd w:id="24"/>
-    <w:bookmarkStart w:id="31" w:name="use-cases"/>
+    <w:bookmarkEnd w:id="35"/>
+    <w:bookmarkEnd w:id="36"/>
+    <w:bookmarkStart w:id="55" w:name="use-cases"/>
     <w:p>
       <w:pPr>
         <w:pStyle w:val="Heading1"/>
@@ -2476,7 +2140,7 @@
         <w:t xml:space="preserve">4. Use Cases</w:t>
       </w:r>
     </w:p>
-    <w:bookmarkStart w:id="25" w:name="vue-densemble"/>
+    <w:bookmarkStart w:id="40" w:name="vue-densemble"/>
     <w:p>
       <w:pPr>
         <w:pStyle w:val="Heading2"/>
@@ -2487,254 +2151,53 @@
     </w:p>
     <w:p>
       <w:pPr>
-        <w:pStyle w:val="SourceCode"/>
-      </w:pPr>
-      <w:r>
-        <w:rPr>
-          <w:rStyle w:val="VerbatimChar"/>
-        </w:rPr>
-        <w:t xml:space="preserve">flowchart LR</w:t>
-      </w:r>
-      <w:r>
-        <w:br/>
-      </w:r>
-      <w:r>
-        <w:rPr>
-          <w:rStyle w:val="VerbatimChar"/>
-        </w:rPr>
-        <w:t xml:space="preserve">    subgraph P[Plateforme]</w:t>
-      </w:r>
-      <w:r>
-        <w:br/>
-      </w:r>
-      <w:r>
-        <w:rPr>
-          <w:rStyle w:val="VerbatimChar"/>
-        </w:rPr>
-        <w:t xml:space="preserve">        UC00[S'inscrire] --&gt; UC01[Se connecter] --&gt; UC02[Choisir le mode]</w:t>
-      </w:r>
-      <w:r>
-        <w:br/>
-      </w:r>
-      <w:r>
-        <w:rPr>
-          <w:rStyle w:val="VerbatimChar"/>
-        </w:rPr>
-        <w:t xml:space="preserve">    end</w:t>
-      </w:r>
-      <w:r>
-        <w:br/>
-      </w:r>
-      <w:r>
-        <w:rPr>
-          <w:rStyle w:val="VerbatimChar"/>
-        </w:rPr>
-        <w:t xml:space="preserve">    subgraph D[Donnees]</w:t>
-      </w:r>
-      <w:r>
-        <w:br/>
-      </w:r>
-      <w:r>
-        <w:rPr>
-          <w:rStyle w:val="VerbatimChar"/>
-        </w:rPr>
-        <w:t xml:space="preserve">        UC03[Charger] --&gt; UC05[Valider]</w:t>
-      </w:r>
-      <w:r>
-        <w:br/>
-      </w:r>
-      <w:r>
-        <w:rPr>
-          <w:rStyle w:val="VerbatimChar"/>
-        </w:rPr>
-        <w:t xml:space="preserve">        UC04[Source en ligne] --&gt; UC05</w:t>
-      </w:r>
-      <w:r>
-        <w:br/>
-      </w:r>
-      <w:r>
-        <w:rPr>
-          <w:rStyle w:val="VerbatimChar"/>
-        </w:rPr>
-        <w:t xml:space="preserve">        UC05 --&gt; UC06[Nettoyer]</w:t>
-      </w:r>
-      <w:r>
-        <w:br/>
-      </w:r>
-      <w:r>
-        <w:rPr>
-          <w:rStyle w:val="VerbatimChar"/>
-        </w:rPr>
-        <w:t xml:space="preserve">    end</w:t>
-      </w:r>
-      <w:r>
-        <w:br/>
-      </w:r>
-      <w:r>
-        <w:rPr>
-          <w:rStyle w:val="VerbatimChar"/>
-        </w:rPr>
-        <w:t xml:space="preserve">    subgraph G[Graphique]</w:t>
-      </w:r>
-      <w:r>
-        <w:br/>
-      </w:r>
-      <w:r>
-        <w:rPr>
-          <w:rStyle w:val="VerbatimChar"/>
-        </w:rPr>
-        <w:t xml:space="preserve">        UC07[Decrire contexte] --&gt; UC08[Valider contexte]</w:t>
-      </w:r>
-      <w:r>
-        <w:br/>
-      </w:r>
-      <w:r>
-        <w:rPr>
-          <w:rStyle w:val="VerbatimChar"/>
-        </w:rPr>
-        <w:t xml:space="preserve">        UC08 --&gt; UC09[Generer graphique]</w:t>
-      </w:r>
-      <w:r>
-        <w:br/>
-      </w:r>
-      <w:r>
-        <w:rPr>
-          <w:rStyle w:val="VerbatimChar"/>
-        </w:rPr>
-        <w:t xml:space="preserve">        UC09 --&gt; UC10[Distribution verticale]</w:t>
-      </w:r>
-      <w:r>
-        <w:br/>
-      </w:r>
-      <w:r>
-        <w:rPr>
-          <w:rStyle w:val="VerbatimChar"/>
-        </w:rPr>
-        <w:t xml:space="preserve">        UC09 --&gt; UC11[Spatio-temporel]</w:t>
-      </w:r>
-      <w:r>
-        <w:br/>
-      </w:r>
-      <w:r>
-        <w:rPr>
-          <w:rStyle w:val="VerbatimChar"/>
-        </w:rPr>
-        <w:t xml:space="preserve">        UC09 --&gt; UC12[Taxonomie]</w:t>
-      </w:r>
-      <w:r>
-        <w:br/>
-      </w:r>
-      <w:r>
-        <w:rPr>
-          <w:rStyle w:val="VerbatimChar"/>
-        </w:rPr>
-        <w:t xml:space="preserve">        UC09 --&gt; UC13[CTD]</w:t>
-      </w:r>
-      <w:r>
-        <w:br/>
-      </w:r>
-      <w:r>
-        <w:rPr>
-          <w:rStyle w:val="VerbatimChar"/>
-        </w:rPr>
-        <w:t xml:space="preserve">        UC09 --&gt; UC14[Lacunes]</w:t>
-      </w:r>
-      <w:r>
-        <w:br/>
-      </w:r>
-      <w:r>
-        <w:rPr>
-          <w:rStyle w:val="VerbatimChar"/>
-        </w:rPr>
-        <w:t xml:space="preserve">        UC09 --&gt; UC15[Variable derivee]</w:t>
-      </w:r>
-      <w:r>
-        <w:br/>
-      </w:r>
-      <w:r>
-        <w:rPr>
-          <w:rStyle w:val="VerbatimChar"/>
-        </w:rPr>
-        <w:t xml:space="preserve">    end</w:t>
-      </w:r>
-      <w:r>
-        <w:br/>
-      </w:r>
-      <w:r>
-        <w:rPr>
-          <w:rStyle w:val="VerbatimChar"/>
-        </w:rPr>
-        <w:t xml:space="preserve">    subgraph L[Livrables]</w:t>
-      </w:r>
-      <w:r>
-        <w:br/>
-      </w:r>
-      <w:r>
-        <w:rPr>
-          <w:rStyle w:val="VerbatimChar"/>
-        </w:rPr>
-        <w:t xml:space="preserve">        UC16[Resume session]</w:t>
-      </w:r>
-      <w:r>
-        <w:br/>
-      </w:r>
-      <w:r>
-        <w:rPr>
-          <w:rStyle w:val="VerbatimChar"/>
-        </w:rPr>
-        <w:t xml:space="preserve">        UC17[Livrable scientifique]</w:t>
-      </w:r>
-      <w:r>
-        <w:br/>
-      </w:r>
-      <w:r>
-        <w:rPr>
-          <w:rStyle w:val="VerbatimChar"/>
-        </w:rPr>
-        <w:t xml:space="preserve">    end</w:t>
-      </w:r>
-      <w:r>
-        <w:br/>
-      </w:r>
-      <w:r>
-        <w:br/>
-      </w:r>
-      <w:r>
-        <w:rPr>
-          <w:rStyle w:val="VerbatimChar"/>
-        </w:rPr>
-        <w:t xml:space="preserve">    UC02 --&gt; UC03</w:t>
-      </w:r>
-      <w:r>
-        <w:br/>
-      </w:r>
-      <w:r>
-        <w:rPr>
-          <w:rStyle w:val="VerbatimChar"/>
-        </w:rPr>
-        <w:t xml:space="preserve">    UC06 --&gt; UC07</w:t>
-      </w:r>
-      <w:r>
-        <w:br/>
-      </w:r>
-      <w:r>
-        <w:rPr>
-          <w:rStyle w:val="VerbatimChar"/>
-        </w:rPr>
-        <w:t xml:space="preserve">    UC09 --&gt; UC16</w:t>
-      </w:r>
-      <w:r>
-        <w:br/>
-      </w:r>
-      <w:r>
-        <w:rPr>
-          <w:rStyle w:val="VerbatimChar"/>
-        </w:rPr>
-        <w:t xml:space="preserve">    UC09 --&gt; UC17</w:t>
-      </w:r>
-    </w:p>
-    <w:bookmarkEnd w:id="25"/>
-    <w:bookmarkStart w:id="26" w:name="plateforme"/>
+        <w:pStyle w:val="FirstParagraph"/>
+      </w:pPr>
+      <w:r>
+        <w:drawing>
+          <wp:inline>
+            <wp:extent cx="5334000" cy="2238375"/>
+            <wp:effectExtent b="0" l="0" r="0" t="0"/>
+            <wp:docPr descr="" title="" id="38" name="Picture"/>
+            <a:graphic>
+              <a:graphicData uri="http://schemas.openxmlformats.org/drawingml/2006/picture">
+                <pic:pic>
+                  <pic:nvPicPr>
+                    <pic:cNvPr descr="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" id="39" name="Picture"/>
+                    <pic:cNvPicPr>
+                      <a:picLocks noChangeArrowheads="1" noChangeAspect="1"/>
+                    </pic:cNvPicPr>
+                  </pic:nvPicPr>
+                  <pic:blipFill>
+                    <a:blip r:embed="rId37"/>
+                    <a:stretch>
+                      <a:fillRect/>
+                    </a:stretch>
+                  </pic:blipFill>
+                  <pic:spPr bwMode="auto">
+                    <a:xfrm>
+                      <a:off x="0" y="0"/>
+                      <a:ext cx="5334000" cy="2238375"/>
+                    </a:xfrm>
+                    <a:prstGeom prst="rect">
+                      <a:avLst/>
+                    </a:prstGeom>
+                    <a:noFill/>
+                    <a:ln w="9525">
+                      <a:noFill/>
+                      <a:headEnd/>
+                      <a:tailEnd/>
+                    </a:ln>
+                  </pic:spPr>
+                </pic:pic>
+              </a:graphicData>
+            </a:graphic>
+          </wp:inline>
+        </w:drawing>
+      </w:r>
+    </w:p>
+    <w:bookmarkEnd w:id="40"/>
+    <w:bookmarkStart w:id="41" w:name="plateforme"/>
     <w:p>
       <w:pPr>
         <w:pStyle w:val="Heading2"/>
@@ -2908,8 +2371,8 @@
         </w:tc>
       </w:tr>
     </w:tbl>
-    <w:bookmarkEnd w:id="26"/>
-    <w:bookmarkStart w:id="27" w:name="gestion-des-données"/>
+    <w:bookmarkEnd w:id="41"/>
+    <w:bookmarkStart w:id="45" w:name="gestion-des-données"/>
     <w:p>
       <w:pPr>
         <w:pStyle w:val="Heading2"/>
@@ -2920,45 +2383,54 @@
     </w:p>
     <w:p>
       <w:pPr>
-        <w:pStyle w:val="SourceCode"/>
-      </w:pPr>
-      <w:r>
-        <w:rPr>
-          <w:rStyle w:val="VerbatimChar"/>
-        </w:rPr>
-        <w:t xml:space="preserve">flowchart LR</w:t>
-      </w:r>
-      <w:r>
-        <w:br/>
-      </w:r>
-      <w:r>
-        <w:rPr>
-          <w:rStyle w:val="VerbatimChar"/>
-        </w:rPr>
-        <w:t xml:space="preserve">    UC03[Charger des données] --&gt; UC05[Valider les données]</w:t>
-      </w:r>
-      <w:r>
-        <w:br/>
-      </w:r>
-      <w:r>
-        <w:rPr>
-          <w:rStyle w:val="VerbatimChar"/>
-        </w:rPr>
-        <w:t xml:space="preserve">    UC04[Interroger source\nen ligne] --&gt; UC05</w:t>
-      </w:r>
-      <w:r>
-        <w:br/>
-      </w:r>
-      <w:r>
-        <w:rPr>
-          <w:rStyle w:val="VerbatimChar"/>
-        </w:rPr>
-        <w:t xml:space="preserve">    UC05 --&gt; UC06[Nettoyer\nsi nécessaire]</w:t>
-      </w:r>
-    </w:p>
-    <w:p>
-      <w:pPr>
         <w:pStyle w:val="FirstParagraph"/>
+      </w:pPr>
+      <w:r>
+        <w:drawing>
+          <wp:inline>
+            <wp:extent cx="5334000" cy="1514103"/>
+            <wp:effectExtent b="0" l="0" r="0" t="0"/>
+            <wp:docPr descr="" title="" id="43" name="Picture"/>
+            <a:graphic>
+              <a:graphicData uri="http://schemas.openxmlformats.org/drawingml/2006/picture">
+                <pic:pic>
+                  <pic:nvPicPr>
+                    <pic:cNvPr descr="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" id="44" name="Picture"/>
+                    <pic:cNvPicPr>
+                      <a:picLocks noChangeArrowheads="1" noChangeAspect="1"/>
+                    </pic:cNvPicPr>
+                  </pic:nvPicPr>
+                  <pic:blipFill>
+                    <a:blip r:embed="rId42"/>
+                    <a:stretch>
+                      <a:fillRect/>
+                    </a:stretch>
+                  </pic:blipFill>
+                  <pic:spPr bwMode="auto">
+                    <a:xfrm>
+                      <a:off x="0" y="0"/>
+                      <a:ext cx="5334000" cy="1514103"/>
+                    </a:xfrm>
+                    <a:prstGeom prst="rect">
+                      <a:avLst/>
+                    </a:prstGeom>
+                    <a:noFill/>
+                    <a:ln w="9525">
+                      <a:noFill/>
+                      <a:headEnd/>
+                      <a:tailEnd/>
+                    </a:ln>
+                  </pic:spPr>
+                </pic:pic>
+              </a:graphicData>
+            </a:graphic>
+          </wp:inline>
+        </w:drawing>
+      </w:r>
+    </w:p>
+    <w:p>
+      <w:pPr>
+        <w:pStyle w:val="BodyText"/>
       </w:pPr>
       <w:r>
         <w:rPr>
@@ -3064,8 +2536,8 @@
         <w:t xml:space="preserve">— jamais sur les fichiers originaux.</w:t>
       </w:r>
     </w:p>
-    <w:bookmarkEnd w:id="27"/>
-    <w:bookmarkStart w:id="28" w:name="planification-graphique"/>
+    <w:bookmarkEnd w:id="45"/>
+    <w:bookmarkStart w:id="49" w:name="planification-graphique"/>
     <w:p>
       <w:pPr>
         <w:pStyle w:val="Heading2"/>
@@ -3076,36 +2548,54 @@
     </w:p>
     <w:p>
       <w:pPr>
-        <w:pStyle w:val="SourceCode"/>
-      </w:pPr>
-      <w:r>
-        <w:rPr>
-          <w:rStyle w:val="VerbatimChar"/>
-        </w:rPr>
-        <w:t xml:space="preserve">flowchart LR</w:t>
-      </w:r>
-      <w:r>
-        <w:br/>
-      </w:r>
-      <w:r>
-        <w:rPr>
-          <w:rStyle w:val="VerbatimChar"/>
-        </w:rPr>
-        <w:t xml:space="preserve">    UC07[Décrire le contexte\ndu graphique] --&gt; UC08[Valider la\nreformulation]</w:t>
-      </w:r>
-      <w:r>
-        <w:br/>
-      </w:r>
-      <w:r>
-        <w:rPr>
-          <w:rStyle w:val="VerbatimChar"/>
-        </w:rPr>
-        <w:t xml:space="preserve">    UC08 --&gt;|contexte validé| MA[Mode Analyse\nprêt]</w:t>
-      </w:r>
-    </w:p>
-    <w:p>
-      <w:pPr>
         <w:pStyle w:val="FirstParagraph"/>
+      </w:pPr>
+      <w:r>
+        <w:drawing>
+          <wp:inline>
+            <wp:extent cx="5334000" cy="606336"/>
+            <wp:effectExtent b="0" l="0" r="0" t="0"/>
+            <wp:docPr descr="" title="" id="47" name="Picture"/>
+            <a:graphic>
+              <a:graphicData uri="http://schemas.openxmlformats.org/drawingml/2006/picture">
+                <pic:pic>
+                  <pic:nvPicPr>
+                    <pic:cNvPr descr="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" id="48" name="Picture"/>
+                    <pic:cNvPicPr>
+                      <a:picLocks noChangeArrowheads="1" noChangeAspect="1"/>
+                    </pic:cNvPicPr>
+                  </pic:nvPicPr>
+                  <pic:blipFill>
+                    <a:blip r:embed="rId46"/>
+                    <a:stretch>
+                      <a:fillRect/>
+                    </a:stretch>
+                  </pic:blipFill>
+                  <pic:spPr bwMode="auto">
+                    <a:xfrm>
+                      <a:off x="0" y="0"/>
+                      <a:ext cx="5334000" cy="606336"/>
+                    </a:xfrm>
+                    <a:prstGeom prst="rect">
+                      <a:avLst/>
+                    </a:prstGeom>
+                    <a:noFill/>
+                    <a:ln w="9525">
+                      <a:noFill/>
+                      <a:headEnd/>
+                      <a:tailEnd/>
+                    </a:ln>
+                  </pic:spPr>
+                </pic:pic>
+              </a:graphicData>
+            </a:graphic>
+          </wp:inline>
+        </w:drawing>
+      </w:r>
+    </w:p>
+    <w:p>
+      <w:pPr>
+        <w:pStyle w:val="BodyText"/>
       </w:pPr>
       <w:r>
         <w:rPr>
@@ -3149,8 +2639,8 @@
         <w:t xml:space="preserve">L’assistant présente une reformulation structurée du contexte graphique. L’utilisateur valide ou corrige. Une fois validé, le contexte est verrouillé — l’assistant ne redemande pas ces informations pendant la génération.</w:t>
       </w:r>
     </w:p>
-    <w:bookmarkEnd w:id="28"/>
-    <w:bookmarkStart w:id="29" w:name="production-graphique"/>
+    <w:bookmarkEnd w:id="49"/>
+    <w:bookmarkStart w:id="53" w:name="production-graphique"/>
     <w:p>
       <w:pPr>
         <w:pStyle w:val="Heading2"/>
@@ -3161,72 +2651,54 @@
     </w:p>
     <w:p>
       <w:pPr>
-        <w:pStyle w:val="SourceCode"/>
-      </w:pPr>
-      <w:r>
-        <w:rPr>
-          <w:rStyle w:val="VerbatimChar"/>
-        </w:rPr>
-        <w:t xml:space="preserve">flowchart TD</w:t>
-      </w:r>
-      <w:r>
-        <w:br/>
-      </w:r>
-      <w:r>
-        <w:rPr>
-          <w:rStyle w:val="VerbatimChar"/>
-        </w:rPr>
-        <w:t xml:space="preserve">    A[Contexte validé] --&gt; B{Colonnes\ndisponibles ?}</w:t>
-      </w:r>
-      <w:r>
-        <w:br/>
-      </w:r>
-      <w:r>
-        <w:rPr>
-          <w:rStyle w:val="VerbatimChar"/>
-        </w:rPr>
-        <w:t xml:space="preserve">    B --&gt;|oui| C[Plan graphique\nespèce · colonnes · filtres · format]</w:t>
-      </w:r>
-      <w:r>
-        <w:br/>
-      </w:r>
-      <w:r>
-        <w:rPr>
-          <w:rStyle w:val="VerbatimChar"/>
-        </w:rPr>
-        <w:t xml:space="preserve">    C --&gt; D[Génération\nPython ou R]</w:t>
-      </w:r>
-      <w:r>
-        <w:br/>
-      </w:r>
-      <w:r>
-        <w:rPr>
-          <w:rStyle w:val="VerbatimChar"/>
-        </w:rPr>
-        <w:t xml:space="preserve">    D --&gt; E[Graphique statique\ntitre · axes · unités · source · limites]</w:t>
-      </w:r>
-      <w:r>
-        <w:br/>
-      </w:r>
-      <w:r>
-        <w:rPr>
-          <w:rStyle w:val="VerbatimChar"/>
-        </w:rPr>
-        <w:t xml:space="preserve">    E --&gt; F[Artefact sauvegardé\nPNG ou SVG]</w:t>
-      </w:r>
-      <w:r>
-        <w:br/>
-      </w:r>
-      <w:r>
-        <w:rPr>
-          <w:rStyle w:val="VerbatimChar"/>
-        </w:rPr>
-        <w:t xml:space="preserve">    B --&gt;|non| G[Blocage explicite\ngraphique demandé · colonnes manquantes · action]</w:t>
-      </w:r>
-    </w:p>
-    <w:p>
-      <w:pPr>
         <w:pStyle w:val="FirstParagraph"/>
+      </w:pPr>
+      <w:r>
+        <w:drawing>
+          <wp:inline>
+            <wp:extent cx="5334000" cy="5069504"/>
+            <wp:effectExtent b="0" l="0" r="0" t="0"/>
+            <wp:docPr descr="" title="" id="51" name="Picture"/>
+            <a:graphic>
+              <a:graphicData uri="http://schemas.openxmlformats.org/drawingml/2006/picture">
+                <pic:pic>
+                  <pic:nvPicPr>
+                    <pic:cNvPr descr="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" id="52" name="Picture"/>
+                    <pic:cNvPicPr>
+                      <a:picLocks noChangeArrowheads="1" noChangeAspect="1"/>
+                    </pic:cNvPicPr>
+                  </pic:nvPicPr>
+                  <pic:blipFill>
+                    <a:blip r:embed="rId50"/>
+                    <a:stretch>
+                      <a:fillRect/>
+                    </a:stretch>
+                  </pic:blipFill>
+                  <pic:spPr bwMode="auto">
+                    <a:xfrm>
+                      <a:off x="0" y="0"/>
+                      <a:ext cx="5334000" cy="5069504"/>
+                    </a:xfrm>
+                    <a:prstGeom prst="rect">
+                      <a:avLst/>
+                    </a:prstGeom>
+                    <a:noFill/>
+                    <a:ln w="9525">
+                      <a:noFill/>
+                      <a:headEnd/>
+                      <a:tailEnd/>
+                    </a:ln>
+                  </pic:spPr>
+                </pic:pic>
+              </a:graphicData>
+            </a:graphic>
+          </wp:inline>
+        </w:drawing>
+      </w:r>
+    </w:p>
+    <w:p>
+      <w:pPr>
+        <w:pStyle w:val="BodyText"/>
       </w:pPr>
       <w:r>
         <w:rPr>
@@ -3501,8 +2973,8 @@
         <w:t xml:space="preserve">Concentration (ind/m³), biomasse carbone (mg C/m²), longueur prosome, indice de plénitude lipidique. Méthode présentée (formule, colonnes requises, unités, limites) avant exécution. Aucun calcul si colonne obligatoire absente.</w:t>
       </w:r>
     </w:p>
-    <w:bookmarkEnd w:id="29"/>
-    <w:bookmarkStart w:id="30" w:name="livrables"/>
+    <w:bookmarkEnd w:id="53"/>
+    <w:bookmarkStart w:id="54" w:name="livrables"/>
     <w:p>
       <w:pPr>
         <w:pStyle w:val="Heading2"/>
@@ -3564,9 +3036,9 @@
         </w:pict>
       </w:r>
     </w:p>
-    <w:bookmarkEnd w:id="30"/>
-    <w:bookmarkEnd w:id="31"/>
-    <w:bookmarkStart w:id="35" w:name="sources-de-données"/>
+    <w:bookmarkEnd w:id="54"/>
+    <w:bookmarkEnd w:id="55"/>
+    <w:bookmarkStart w:id="65" w:name="sources-de-données"/>
     <w:p>
       <w:pPr>
         <w:pStyle w:val="Heading1"/>
@@ -3575,7 +3047,7 @@
         <w:t xml:space="preserve">5. Sources de données</w:t>
       </w:r>
     </w:p>
-    <w:bookmarkStart w:id="32" w:name="sources-disponibles"/>
+    <w:bookmarkStart w:id="56" w:name="sources-disponibles"/>
     <w:p>
       <w:pPr>
         <w:pStyle w:val="Heading2"/>
@@ -3883,8 +3355,8 @@
         <w:t xml:space="preserve">Amundsen CTD est prioritaire sur OGSL quand les deux couvrent le même besoin.</w:t>
       </w:r>
     </w:p>
-    <w:bookmarkEnd w:id="32"/>
-    <w:bookmarkStart w:id="33" w:name="schéma-de-jointure"/>
+    <w:bookmarkEnd w:id="56"/>
+    <w:bookmarkStart w:id="60" w:name="schéma-de-jointure"/>
     <w:p>
       <w:pPr>
         <w:pStyle w:val="Heading2"/>
@@ -3895,40 +3367,94 @@
     </w:p>
     <w:p>
       <w:pPr>
-        <w:pStyle w:val="SourceCode"/>
-      </w:pPr>
+        <w:pStyle w:val="FirstParagraph"/>
+      </w:pPr>
+      <w:r>
+        <w:drawing>
+          <wp:inline>
+            <wp:extent cx="5334000" cy="353785"/>
+            <wp:effectExtent b="0" l="0" r="0" t="0"/>
+            <wp:docPr descr="" title="" id="58" name="Picture"/>
+            <a:graphic>
+              <a:graphicData uri="http://schemas.openxmlformats.org/drawingml/2006/picture">
+                <pic:pic>
+                  <pic:nvPicPr>
+                    <pic:cNvPr descr="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" id="59" name="Picture"/>
+                    <pic:cNvPicPr>
+                      <a:picLocks noChangeArrowheads="1" noChangeAspect="1"/>
+                    </pic:cNvPicPr>
+                  </pic:nvPicPr>
+                  <pic:blipFill>
+                    <a:blip r:embed="rId57"/>
+                    <a:stretch>
+                      <a:fillRect/>
+                    </a:stretch>
+                  </pic:blipFill>
+                  <pic:spPr bwMode="auto">
+                    <a:xfrm>
+                      <a:off x="0" y="0"/>
+                      <a:ext cx="5334000" cy="353785"/>
+                    </a:xfrm>
+                    <a:prstGeom prst="rect">
+                      <a:avLst/>
+                    </a:prstGeom>
+                    <a:noFill/>
+                    <a:ln w="9525">
+                      <a:noFill/>
+                      <a:headEnd/>
+                      <a:tailEnd/>
+                    </a:ln>
+                  </pic:spPr>
+                </pic:pic>
+              </a:graphicData>
+            </a:graphic>
+          </wp:inline>
+        </w:drawing>
+      </w:r>
+    </w:p>
+    <w:p>
+      <w:pPr>
+        <w:pStyle w:val="BodyText"/>
+      </w:pPr>
+      <w:r>
+        <w:t xml:space="preserve">Clé principale :</w:t>
+      </w:r>
+      <w:r>
+        <w:t xml:space="preserve"> </w:t>
+      </w:r>
       <w:r>
         <w:rPr>
           <w:rStyle w:val="VerbatimChar"/>
         </w:rPr>
-        <w:t xml:space="preserve">graph LR</w:t>
-      </w:r>
-      <w:r>
-        <w:br/>
+        <w:t xml:space="preserve">obj_orig_id</w:t>
+      </w:r>
+      <w:r>
+        <w:t xml:space="preserve"> </w:t>
+      </w:r>
+      <w:r>
+        <w:t xml:space="preserve">→</w:t>
+      </w:r>
+      <w:r>
+        <w:t xml:space="preserve"> </w:t>
       </w:r>
       <w:r>
         <w:rPr>
           <w:rStyle w:val="VerbatimChar"/>
         </w:rPr>
-        <w:t xml:space="preserve">    E[EcoTaxa\nobj_orig_id] --&gt;|jointure| P[EcoPart\nprofile_id]</w:t>
-      </w:r>
-      <w:r>
-        <w:br/>
-      </w:r>
-      <w:r>
-        <w:rPr>
-          <w:rStyle w:val="VerbatimChar"/>
-        </w:rPr>
-        <w:t xml:space="preserve">    P --&gt;|profondeur · temps · position| C[Amundsen CTD\nou OGSL]</w:t>
-      </w:r>
-      <w:r>
-        <w:br/>
-      </w:r>
-      <w:r>
-        <w:rPr>
-          <w:rStyle w:val="VerbatimChar"/>
-        </w:rPr>
-        <w:t xml:space="preserve">    L[Fichier labo] --&gt;|colonnes inspectées à la volée| E</w:t>
+        <w:t xml:space="preserve">profile_id</w:t>
+      </w:r>
+      <w:r>
+        <w:t xml:space="preserve">. Toute jointure est documentée (clé, tolérance, pertes, qualité du rapprochement).</w:t>
+      </w:r>
+    </w:p>
+    <w:bookmarkEnd w:id="60"/>
+    <w:bookmarkStart w:id="64" w:name="accès-aux-sources-en-ligne"/>
+    <w:p>
+      <w:pPr>
+        <w:pStyle w:val="Heading2"/>
+      </w:pPr>
+      <w:r>
+        <w:t xml:space="preserve">5.3 Accès aux sources en ligne</w:t>
       </w:r>
     </w:p>
     <w:p>
@@ -3936,196 +3462,46 @@
         <w:pStyle w:val="FirstParagraph"/>
       </w:pPr>
       <w:r>
-        <w:t xml:space="preserve">Clé principale :</w:t>
-      </w:r>
-      <w:r>
-        <w:t xml:space="preserve"> </w:t>
-      </w:r>
-      <w:r>
-        <w:rPr>
-          <w:rStyle w:val="VerbatimChar"/>
-        </w:rPr>
-        <w:t xml:space="preserve">obj_orig_id</w:t>
-      </w:r>
-      <w:r>
-        <w:t xml:space="preserve"> </w:t>
-      </w:r>
-      <w:r>
-        <w:t xml:space="preserve">→</w:t>
-      </w:r>
-      <w:r>
-        <w:t xml:space="preserve"> </w:t>
-      </w:r>
-      <w:r>
-        <w:rPr>
-          <w:rStyle w:val="VerbatimChar"/>
-        </w:rPr>
-        <w:t xml:space="preserve">profile_id</w:t>
-      </w:r>
-      <w:r>
-        <w:t xml:space="preserve">. Toute jointure est documentée (clé, tolérance, pertes, qualité du rapprochement).</w:t>
-      </w:r>
-    </w:p>
-    <w:bookmarkEnd w:id="33"/>
-    <w:bookmarkStart w:id="34" w:name="accès-aux-sources-en-ligne"/>
-    <w:p>
-      <w:pPr>
-        <w:pStyle w:val="Heading2"/>
-      </w:pPr>
-      <w:r>
-        <w:t xml:space="preserve">5.3 Accès aux sources en ligne</w:t>
-      </w:r>
-    </w:p>
-    <w:p>
-      <w:pPr>
-        <w:pStyle w:val="SourceCode"/>
-      </w:pPr>
-      <w:r>
-        <w:rPr>
-          <w:rStyle w:val="VerbatimChar"/>
-        </w:rPr>
-        <w:t xml:space="preserve">graph TD</w:t>
-      </w:r>
-      <w:r>
-        <w:br/>
-      </w:r>
-      <w:r>
-        <w:rPr>
-          <w:rStyle w:val="VerbatimChar"/>
-        </w:rPr>
-        <w:t xml:space="preserve">    REQ[L'utilisateur demande\nune source externe] --&gt; CHECK{Mode En Ligne\nactivé pour cette source ?}</w:t>
-      </w:r>
-      <w:r>
-        <w:br/>
-      </w:r>
-      <w:r>
-        <w:br/>
-      </w:r>
-      <w:r>
-        <w:rPr>
-          <w:rStyle w:val="VerbatimChar"/>
-        </w:rPr>
-        <w:t xml:space="preserve">    CHECK --&gt;|Non| BLOQ[Blocage\nProposition d'activer ou charger\nun fichier local équivalent]</w:t>
-      </w:r>
-      <w:r>
-        <w:br/>
-      </w:r>
-      <w:r>
-        <w:br/>
-      </w:r>
-      <w:r>
-        <w:rPr>
-          <w:rStyle w:val="VerbatimChar"/>
-        </w:rPr>
-        <w:t xml:space="preserve">    CHECK --&gt;|EcoTaxa ou EcoPart| LIST[Liste des projets\nauxquels vous avez accès]</w:t>
-      </w:r>
-      <w:r>
-        <w:br/>
-      </w:r>
-      <w:r>
-        <w:rPr>
-          <w:rStyle w:val="VerbatimChar"/>
-        </w:rPr>
-        <w:t xml:space="preserve">    LIST --&gt; SELECT[Vous choisissez le projet]</w:t>
-      </w:r>
-      <w:r>
-        <w:br/>
-      </w:r>
-      <w:r>
-        <w:rPr>
-          <w:rStyle w:val="VerbatimChar"/>
-        </w:rPr>
-        <w:t xml:space="preserve">    SELECT --&gt; EXPORT[Récupération des données\nidentifiant dynamique - jamais codé en dur]</w:t>
-      </w:r>
-      <w:r>
-        <w:br/>
-      </w:r>
-      <w:r>
-        <w:rPr>
-          <w:rStyle w:val="VerbatimChar"/>
-        </w:rPr>
-        <w:t xml:space="preserve">    EXPORT --&gt; WAIT{Traitement\nen cours}</w:t>
-      </w:r>
-      <w:r>
-        <w:br/>
-      </w:r>
-      <w:r>
-        <w:rPr>
-          <w:rStyle w:val="VerbatimChar"/>
-        </w:rPr>
-        <w:t xml:space="preserve">    WAIT --&gt;|terminé| READY[Données disponibles\npour la planification graphique]</w:t>
-      </w:r>
-      <w:r>
-        <w:br/>
-      </w:r>
-      <w:r>
-        <w:rPr>
-          <w:rStyle w:val="VerbatimChar"/>
-        </w:rPr>
-        <w:t xml:space="preserve">    WAIT --&gt;|erreur| ERR[Message d'erreur\nsans exposer vos credentials]</w:t>
-      </w:r>
-      <w:r>
-        <w:br/>
-      </w:r>
-      <w:r>
-        <w:br/>
-      </w:r>
-      <w:r>
-        <w:rPr>
-          <w:rStyle w:val="VerbatimChar"/>
-        </w:rPr>
-        <w:t xml:space="preserve">    CHECK --&gt;|Amundsen CTD| AM[Requête ERDDAP\ndate · lat/lon · variables]</w:t>
-      </w:r>
-      <w:r>
-        <w:br/>
-      </w:r>
-      <w:r>
-        <w:rPr>
-          <w:rStyle w:val="VerbatimChar"/>
-        </w:rPr>
-        <w:t xml:space="preserve">    AM --&gt; READY</w:t>
-      </w:r>
-      <w:r>
-        <w:br/>
-      </w:r>
-      <w:r>
-        <w:br/>
-      </w:r>
-      <w:r>
-        <w:rPr>
-          <w:rStyle w:val="VerbatimChar"/>
-        </w:rPr>
-        <w:t xml:space="preserve">    CHECK --&gt;|OGSL| OG[Données régionales\ngolfe du Saint-Laurent]</w:t>
-      </w:r>
-      <w:r>
-        <w:br/>
-      </w:r>
-      <w:r>
-        <w:rPr>
-          <w:rStyle w:val="VerbatimChar"/>
-        </w:rPr>
-        <w:t xml:space="preserve">    OG --&gt; READY</w:t>
-      </w:r>
-      <w:r>
-        <w:br/>
-      </w:r>
-      <w:r>
-        <w:br/>
-      </w:r>
-      <w:r>
-        <w:rPr>
-          <w:rStyle w:val="VerbatimChar"/>
-        </w:rPr>
-        <w:t xml:space="preserve">    CHECK --&gt;|Bio-ORACLE| BO[Conditions environnementales\nactuelles ou futures]</w:t>
-      </w:r>
-      <w:r>
-        <w:br/>
-      </w:r>
-      <w:r>
-        <w:rPr>
-          <w:rStyle w:val="VerbatimChar"/>
-        </w:rPr>
-        <w:t xml:space="preserve">    BO --&gt; READY</w:t>
+        <w:drawing>
+          <wp:inline>
+            <wp:extent cx="5334000" cy="4429125"/>
+            <wp:effectExtent b="0" l="0" r="0" t="0"/>
+            <wp:docPr descr="" title="" id="62" name="Picture"/>
+            <a:graphic>
+              <a:graphicData uri="http://schemas.openxmlformats.org/drawingml/2006/picture">
+                <pic:pic>
+                  <pic:nvPicPr>
+                    <pic:cNvPr descr="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" id="63" name="Picture"/>
+                    <pic:cNvPicPr>
+                      <a:picLocks noChangeArrowheads="1" noChangeAspect="1"/>
+                    </pic:cNvPicPr>
+                  </pic:nvPicPr>
+                  <pic:blipFill>
+                    <a:blip r:embed="rId61"/>
+                    <a:stretch>
+                      <a:fillRect/>
+                    </a:stretch>
+                  </pic:blipFill>
+                  <pic:spPr bwMode="auto">
+                    <a:xfrm>
+                      <a:off x="0" y="0"/>
+                      <a:ext cx="5334000" cy="4429125"/>
+                    </a:xfrm>
+                    <a:prstGeom prst="rect">
+                      <a:avLst/>
+                    </a:prstGeom>
+                    <a:noFill/>
+                    <a:ln w="9525">
+                      <a:noFill/>
+                      <a:headEnd/>
+                      <a:tailEnd/>
+                    </a:ln>
+                  </pic:spPr>
+                </pic:pic>
+              </a:graphicData>
+            </a:graphic>
+          </wp:inline>
+        </w:drawing>
       </w:r>
     </w:p>
     <w:p>
@@ -4135,9 +3511,9 @@
         </w:pict>
       </w:r>
     </w:p>
-    <w:bookmarkEnd w:id="34"/>
-    <w:bookmarkEnd w:id="35"/>
-    <w:bookmarkStart w:id="40" w:name="exigences-fonctionnelles"/>
+    <w:bookmarkEnd w:id="64"/>
+    <w:bookmarkEnd w:id="65"/>
+    <w:bookmarkStart w:id="70" w:name="exigences-fonctionnelles"/>
     <w:p>
       <w:pPr>
         <w:pStyle w:val="Heading1"/>
@@ -4154,7 +3530,7 @@
         <w:t xml:space="preserve">Les exigences suivantes découlent directement des use cases. Chaque exigence est traçable à une contrainte agent (CT-AG-XX).</w:t>
       </w:r>
     </w:p>
-    <w:bookmarkStart w:id="36" w:name="données-et-sources"/>
+    <w:bookmarkStart w:id="66" w:name="données-et-sources"/>
     <w:p>
       <w:pPr>
         <w:pStyle w:val="Heading2"/>
@@ -4529,8 +3905,8 @@
         </w:tc>
       </w:tr>
     </w:tbl>
-    <w:bookmarkEnd w:id="36"/>
-    <w:bookmarkStart w:id="37" w:name="planification-et-génération-graphique"/>
+    <w:bookmarkEnd w:id="66"/>
+    <w:bookmarkStart w:id="67" w:name="planification-et-génération-graphique"/>
     <w:p>
       <w:pPr>
         <w:pStyle w:val="Heading2"/>
@@ -4870,8 +4246,8 @@
         </w:tc>
       </w:tr>
     </w:tbl>
-    <w:bookmarkEnd w:id="37"/>
-    <w:bookmarkStart w:id="38" w:name="qualité-et-traçabilité"/>
+    <w:bookmarkEnd w:id="67"/>
+    <w:bookmarkStart w:id="68" w:name="qualité-et-traçabilité"/>
     <w:p>
       <w:pPr>
         <w:pStyle w:val="Heading2"/>
@@ -5141,8 +4517,8 @@
         </w:tc>
       </w:tr>
     </w:tbl>
-    <w:bookmarkEnd w:id="38"/>
-    <w:bookmarkStart w:id="39" w:name="interface"/>
+    <w:bookmarkEnd w:id="68"/>
+    <w:bookmarkStart w:id="69" w:name="interface"/>
     <w:p>
       <w:pPr>
         <w:pStyle w:val="Heading2"/>
@@ -5349,9 +4725,9 @@
         </w:pict>
       </w:r>
     </w:p>
-    <w:bookmarkEnd w:id="39"/>
-    <w:bookmarkEnd w:id="40"/>
-    <w:bookmarkStart w:id="41" w:name="exigences-non-fonctionnelles"/>
+    <w:bookmarkEnd w:id="69"/>
+    <w:bookmarkEnd w:id="70"/>
+    <w:bookmarkStart w:id="71" w:name="exigences-non-fonctionnelles"/>
     <w:p>
       <w:pPr>
         <w:pStyle w:val="Heading1"/>
@@ -5688,8 +5064,8 @@
         </w:pict>
       </w:r>
     </w:p>
-    <w:bookmarkEnd w:id="41"/>
-    <w:bookmarkStart w:id="42" w:name="ce-qui-est-hors-périmètre-v1"/>
+    <w:bookmarkEnd w:id="71"/>
+    <w:bookmarkStart w:id="72" w:name="ce-qui-est-hors-périmètre-v1"/>
     <w:p>
       <w:pPr>
         <w:pStyle w:val="Heading1"/>
@@ -5801,8 +5177,8 @@
         </w:pict>
       </w:r>
     </w:p>
-    <w:bookmarkEnd w:id="42"/>
-    <w:bookmarkStart w:id="46" w:name="contraintes-transversales"/>
+    <w:bookmarkEnd w:id="72"/>
+    <w:bookmarkStart w:id="76" w:name="contraintes-transversales"/>
     <w:p>
       <w:pPr>
         <w:pStyle w:val="Heading1"/>
@@ -5829,7 +5205,7 @@
         <w:t xml:space="preserve">cette section est une référence complète, pas à lire linéairement. Consultez-la quand vous cherchez le comportement attendu dans une situation précise.</w:t>
       </w:r>
     </w:p>
-    <w:bookmarkStart w:id="43" w:name="données-et-sources-1"/>
+    <w:bookmarkStart w:id="73" w:name="données-et-sources-1"/>
     <w:p>
       <w:pPr>
         <w:pStyle w:val="Heading2"/>
@@ -6114,8 +5490,8 @@
         <w:t xml:space="preserve">Téléchargement limité à ce qui est nécessaire. Inspection des métadonnées avant téléchargement ; validation demandée avant une récupération lourde.</w:t>
       </w:r>
     </w:p>
-    <w:bookmarkEnd w:id="43"/>
-    <w:bookmarkStart w:id="44" w:name="qualité-scientifique"/>
+    <w:bookmarkEnd w:id="73"/>
+    <w:bookmarkStart w:id="74" w:name="qualité-scientifique"/>
     <w:p>
       <w:pPr>
         <w:pStyle w:val="Heading2"/>
@@ -6286,8 +5662,8 @@
         <w:t xml:space="preserve">Avant d’afficher un résultat, l’assistant vérifie que les chiffres et affirmations sont cohérents avec les données sources.</w:t>
       </w:r>
     </w:p>
-    <w:bookmarkEnd w:id="44"/>
-    <w:bookmarkStart w:id="45" w:name="interface-et-comportement"/>
+    <w:bookmarkEnd w:id="74"/>
+    <w:bookmarkStart w:id="75" w:name="interface-et-comportement"/>
     <w:p>
       <w:pPr>
         <w:pStyle w:val="Heading2"/>
@@ -6571,9 +5947,9 @@
         </w:pict>
       </w:r>
     </w:p>
-    <w:bookmarkEnd w:id="45"/>
-    <w:bookmarkEnd w:id="46"/>
-    <w:bookmarkStart w:id="47" w:name="glossaire"/>
+    <w:bookmarkEnd w:id="75"/>
+    <w:bookmarkEnd w:id="76"/>
+    <w:bookmarkStart w:id="77" w:name="glossaire"/>
     <w:p>
       <w:pPr>
         <w:pStyle w:val="Heading1"/>
@@ -7181,7 +6557,7 @@
         </w:tc>
       </w:tr>
     </w:tbl>
-    <w:bookmarkEnd w:id="47"/>
+    <w:bookmarkEnd w:id="77"/>
     <w:sectPr>
       <w:footnotePr>
         <w:numRestart w:val="eachSect"/>

</xml_diff>

<commit_message>
docs: add TOC and document intro to PRD v1.1
Co-Authored-By: Claude Sonnet 4.6 <noreply@anthropic.com>
</commit_message>
<xml_diff>
--- a/docs/PRD_IDEA_copepod.docx
+++ b/docs/PRD_IDEA_copepod.docx
@@ -52,7 +52,7 @@
         </w:p>
       </w:sdtContent>
     </w:sdt>
-    <w:bookmarkStart w:id="30" w:name="assistant-graphique-copépodes-prd"/>
+    <w:bookmarkStart w:id="32" w:name="assistant-graphique-copépodes-prd"/>
     <w:p>
       <w:pPr>
         <w:pStyle w:val="Heading1"/>
@@ -150,7 +150,7 @@
               <w:pStyle w:val="Compact"/>
             </w:pPr>
             <w:r>
-              <w:t xml:space="preserve">Approuvé — prêt pour implémentation</w:t>
+              <w:t xml:space="preserve">Partiellement Approuvé</w:t>
             </w:r>
           </w:p>
         </w:tc>
@@ -191,7 +191,297 @@
         </w:pict>
       </w:r>
     </w:p>
-    <w:bookmarkStart w:id="9" w:name="historique-des-versions"/>
+    <w:bookmarkStart w:id="9" w:name="à-propos-de-ce-document"/>
+    <w:p>
+      <w:pPr>
+        <w:pStyle w:val="Heading2"/>
+      </w:pPr>
+      <w:r>
+        <w:t xml:space="preserve">À propos de ce document</w:t>
+      </w:r>
+    </w:p>
+    <w:p>
+      <w:pPr>
+        <w:pStyle w:val="FirstParagraph"/>
+      </w:pPr>
+      <w:r>
+        <w:t xml:space="preserve">Ce document décrit les exigences produit de l’assistant graphique copépodes — un profil de la plateforme IDEA (Université d’Hawaii) adapté aux données marines de NeoLab (Université Laval).</w:t>
+      </w:r>
+    </w:p>
+    <w:p>
+      <w:pPr>
+        <w:pStyle w:val="BodyText"/>
+      </w:pPr>
+      <w:r>
+        <w:t xml:space="preserve">Il s’adresse aux chercheurs NeoLab qui utiliseront l’outil, aux développeurs qui l’implémentent, et à toute personne qui veut comprendre ce que l’assistant fait, pour qui, et selon quelles règles.</w:t>
+      </w:r>
+    </w:p>
+    <w:p>
+      <w:pPr>
+        <w:pStyle w:val="BodyText"/>
+      </w:pPr>
+      <w:r>
+        <w:t xml:space="preserve">Il ne décrit pas comment le système est construit techniquement — pour ça, voir</w:t>
+      </w:r>
+      <w:r>
+        <w:t xml:space="preserve"> </w:t>
+      </w:r>
+      <w:r>
+        <w:rPr>
+          <w:rStyle w:val="VerbatimChar"/>
+        </w:rPr>
+        <w:t xml:space="preserve">ARCHITECTURE.md</w:t>
+      </w:r>
+      <w:r>
+        <w:t xml:space="preserve"> </w:t>
+      </w:r>
+      <w:r>
+        <w:t xml:space="preserve">et</w:t>
+      </w:r>
+      <w:r>
+        <w:t xml:space="preserve"> </w:t>
+      </w:r>
+      <w:r>
+        <w:rPr>
+          <w:rStyle w:val="VerbatimChar"/>
+        </w:rPr>
+        <w:t xml:space="preserve">docs/adr/</w:t>
+      </w:r>
+      <w:r>
+        <w:t xml:space="preserve">.</w:t>
+      </w:r>
+    </w:p>
+    <w:p>
+      <w:r>
+        <w:pict>
+          <v:rect style="width:0;height:1.5pt" o:hralign="center" o:hrstd="t" o:hr="t"/>
+        </w:pict>
+      </w:r>
+    </w:p>
+    <w:bookmarkEnd w:id="9"/>
+    <w:bookmarkStart w:id="10" w:name="table-des-matières"/>
+    <w:p>
+      <w:pPr>
+        <w:pStyle w:val="Heading2"/>
+      </w:pPr>
+      <w:r>
+        <w:t xml:space="preserve">Table des matières</w:t>
+      </w:r>
+    </w:p>
+    <w:p>
+      <w:pPr>
+        <w:pStyle w:val="Compact"/>
+        <w:numPr>
+          <w:ilvl w:val="0"/>
+          <w:numId w:val="1001"/>
+        </w:numPr>
+      </w:pPr>
+      <w:hyperlink w:anchor="Xea270ad136faec18c8609ec1f8481c1470689ad">
+        <w:r>
+          <w:rPr>
+            <w:rStyle w:val="Hyperlink"/>
+          </w:rPr>
+          <w:t xml:space="preserve">Problème</w:t>
+        </w:r>
+      </w:hyperlink>
+    </w:p>
+    <w:p>
+      <w:pPr>
+        <w:pStyle w:val="Compact"/>
+        <w:numPr>
+          <w:ilvl w:val="0"/>
+          <w:numId w:val="1001"/>
+        </w:numPr>
+      </w:pPr>
+      <w:hyperlink w:anchor="Xadce8170af5008d00a9c78edf5998b8e0c5ecd7">
+        <w:r>
+          <w:rPr>
+            <w:rStyle w:val="Hyperlink"/>
+          </w:rPr>
+          <w:t xml:space="preserve">Solution</w:t>
+        </w:r>
+      </w:hyperlink>
+    </w:p>
+    <w:p>
+      <w:pPr>
+        <w:pStyle w:val="Compact"/>
+        <w:numPr>
+          <w:ilvl w:val="0"/>
+          <w:numId w:val="1001"/>
+        </w:numPr>
+      </w:pPr>
+      <w:hyperlink w:anchor="Xbae214aa2a2179375f28190edbdff0403bafa71">
+        <w:r>
+          <w:rPr>
+            <w:rStyle w:val="Hyperlink"/>
+          </w:rPr>
+          <w:t xml:space="preserve">Acteur</w:t>
+        </w:r>
+      </w:hyperlink>
+    </w:p>
+    <w:p>
+      <w:pPr>
+        <w:pStyle w:val="Compact"/>
+        <w:numPr>
+          <w:ilvl w:val="0"/>
+          <w:numId w:val="1001"/>
+        </w:numPr>
+      </w:pPr>
+      <w:hyperlink w:anchor="X1e6b27d9069da3872bb90854ab0667a1d040223">
+        <w:r>
+          <w:rPr>
+            <w:rStyle w:val="Hyperlink"/>
+          </w:rPr>
+          <w:t xml:space="preserve">Vue d’ensemble</w:t>
+        </w:r>
+      </w:hyperlink>
+    </w:p>
+    <w:p>
+      <w:pPr>
+        <w:pStyle w:val="Compact"/>
+        <w:numPr>
+          <w:ilvl w:val="1"/>
+          <w:numId w:val="1002"/>
+        </w:numPr>
+      </w:pPr>
+      <w:r>
+        <w:t xml:space="preserve">4.1</w:t>
+      </w:r>
+      <w:r>
+        <w:t xml:space="preserve"> </w:t>
+      </w:r>
+      <w:hyperlink w:anchor="X8a0669582fc380effc8a4be61c6a2d48895e27b">
+        <w:r>
+          <w:rPr>
+            <w:rStyle w:val="Hyperlink"/>
+          </w:rPr>
+          <w:t xml:space="preserve">Modes de travail</w:t>
+        </w:r>
+      </w:hyperlink>
+    </w:p>
+    <w:p>
+      <w:pPr>
+        <w:pStyle w:val="Compact"/>
+        <w:numPr>
+          <w:ilvl w:val="1"/>
+          <w:numId w:val="1002"/>
+        </w:numPr>
+      </w:pPr>
+      <w:r>
+        <w:t xml:space="preserve">4.2</w:t>
+      </w:r>
+      <w:r>
+        <w:t xml:space="preserve"> </w:t>
+      </w:r>
+      <w:hyperlink w:anchor="Xce6c3238d8216e5b20cf9b15a7019222922bc4e">
+        <w:r>
+          <w:rPr>
+            <w:rStyle w:val="Hyperlink"/>
+          </w:rPr>
+          <w:t xml:space="preserve">Cycle de vie d’une session</w:t>
+        </w:r>
+      </w:hyperlink>
+    </w:p>
+    <w:p>
+      <w:pPr>
+        <w:pStyle w:val="Compact"/>
+        <w:numPr>
+          <w:ilvl w:val="1"/>
+          <w:numId w:val="1002"/>
+        </w:numPr>
+      </w:pPr>
+      <w:r>
+        <w:t xml:space="preserve">4.3</w:t>
+      </w:r>
+      <w:r>
+        <w:t xml:space="preserve"> </w:t>
+      </w:r>
+      <w:hyperlink w:anchor="Xb332268f814a846f79f7cdb84a1c71dfe7f9cd6">
+        <w:r>
+          <w:rPr>
+            <w:rStyle w:val="Hyperlink"/>
+          </w:rPr>
+          <w:t xml:space="preserve">Use Cases</w:t>
+        </w:r>
+      </w:hyperlink>
+    </w:p>
+    <w:p>
+      <w:pPr>
+        <w:pStyle w:val="Compact"/>
+        <w:numPr>
+          <w:ilvl w:val="0"/>
+          <w:numId w:val="1001"/>
+        </w:numPr>
+      </w:pPr>
+      <w:hyperlink w:anchor="Xe4213d390c8ef336a87ec2f264d57d13d18c189">
+        <w:r>
+          <w:rPr>
+            <w:rStyle w:val="Hyperlink"/>
+          </w:rPr>
+          <w:t xml:space="preserve">Use Cases détaillés</w:t>
+        </w:r>
+      </w:hyperlink>
+    </w:p>
+    <w:p>
+      <w:pPr>
+        <w:pStyle w:val="Compact"/>
+        <w:numPr>
+          <w:ilvl w:val="0"/>
+          <w:numId w:val="1001"/>
+        </w:numPr>
+      </w:pPr>
+      <w:hyperlink w:anchor="X08449514ab73b0c4d2b698ada117d535e46537d">
+        <w:r>
+          <w:rPr>
+            <w:rStyle w:val="Hyperlink"/>
+          </w:rPr>
+          <w:t xml:space="preserve">Sources de données</w:t>
+        </w:r>
+      </w:hyperlink>
+    </w:p>
+    <w:p>
+      <w:pPr>
+        <w:pStyle w:val="Compact"/>
+        <w:numPr>
+          <w:ilvl w:val="0"/>
+          <w:numId w:val="1001"/>
+        </w:numPr>
+      </w:pPr>
+      <w:hyperlink w:anchor="X04f1be6e1e7b62f67ecc99acc331dff7049a0e6">
+        <w:r>
+          <w:rPr>
+            <w:rStyle w:val="Hyperlink"/>
+          </w:rPr>
+          <w:t xml:space="preserve">Contraintes</w:t>
+        </w:r>
+      </w:hyperlink>
+    </w:p>
+    <w:p>
+      <w:pPr>
+        <w:pStyle w:val="Compact"/>
+        <w:numPr>
+          <w:ilvl w:val="0"/>
+          <w:numId w:val="1001"/>
+        </w:numPr>
+      </w:pPr>
+      <w:hyperlink w:anchor="Xe87de9b304e11bab12386f047bc4268856aae02">
+        <w:r>
+          <w:rPr>
+            <w:rStyle w:val="Hyperlink"/>
+          </w:rPr>
+          <w:t xml:space="preserve">Glossaire</w:t>
+        </w:r>
+      </w:hyperlink>
+    </w:p>
+    <w:p>
+      <w:r>
+        <w:pict>
+          <v:rect style="width:0;height:1.5pt" o:hralign="center" o:hrstd="t" o:hr="t"/>
+        </w:pict>
+      </w:r>
+    </w:p>
+    <w:bookmarkEnd w:id="10"/>
+    <w:bookmarkStart w:id="11" w:name="historique-des-versions"/>
     <w:p>
       <w:pPr>
         <w:pStyle w:val="Heading2"/>
@@ -328,8 +618,8 @@
         </w:pict>
       </w:r>
     </w:p>
-    <w:bookmarkEnd w:id="9"/>
-    <w:bookmarkStart w:id="10" w:name="problème"/>
+    <w:bookmarkEnd w:id="11"/>
+    <w:bookmarkStart w:id="12" w:name="problème"/>
     <w:p>
       <w:pPr>
         <w:pStyle w:val="Heading2"/>
@@ -353,8 +643,8 @@
         </w:pict>
       </w:r>
     </w:p>
-    <w:bookmarkEnd w:id="10"/>
-    <w:bookmarkStart w:id="11" w:name="solution"/>
+    <w:bookmarkEnd w:id="12"/>
+    <w:bookmarkStart w:id="13" w:name="solution"/>
     <w:p>
       <w:pPr>
         <w:pStyle w:val="Heading2"/>
@@ -392,7 +682,7 @@
         <w:pStyle w:val="Compact"/>
         <w:numPr>
           <w:ilvl w:val="0"/>
-          <w:numId w:val="1001"/>
+          <w:numId w:val="1003"/>
         </w:numPr>
       </w:pPr>
       <w:r>
@@ -414,7 +704,7 @@
         <w:pStyle w:val="Compact"/>
         <w:numPr>
           <w:ilvl w:val="0"/>
-          <w:numId w:val="1001"/>
+          <w:numId w:val="1003"/>
         </w:numPr>
       </w:pPr>
       <w:r>
@@ -436,7 +726,7 @@
         <w:pStyle w:val="Compact"/>
         <w:numPr>
           <w:ilvl w:val="0"/>
-          <w:numId w:val="1001"/>
+          <w:numId w:val="1003"/>
         </w:numPr>
       </w:pPr>
       <w:r>
@@ -468,8 +758,8 @@
         </w:pict>
       </w:r>
     </w:p>
-    <w:bookmarkEnd w:id="11"/>
-    <w:bookmarkStart w:id="12" w:name="acteur"/>
+    <w:bookmarkEnd w:id="13"/>
+    <w:bookmarkStart w:id="14" w:name="acteur"/>
     <w:p>
       <w:pPr>
         <w:pStyle w:val="Heading2"/>
@@ -503,8 +793,8 @@
         </w:pict>
       </w:r>
     </w:p>
-    <w:bookmarkEnd w:id="12"/>
-    <w:bookmarkStart w:id="25" w:name="vue-densemble"/>
+    <w:bookmarkEnd w:id="14"/>
+    <w:bookmarkStart w:id="27" w:name="vue-densemble"/>
     <w:p>
       <w:pPr>
         <w:pStyle w:val="Heading2"/>
@@ -513,7 +803,7 @@
         <w:t xml:space="preserve">4. Vue d’ensemble</w:t>
       </w:r>
     </w:p>
-    <w:bookmarkStart w:id="16" w:name="modes-de-travail"/>
+    <w:bookmarkStart w:id="18" w:name="modes-de-travail"/>
     <w:p>
       <w:pPr>
         <w:pStyle w:val="Heading3"/>
@@ -531,18 +821,18 @@
           <wp:inline>
             <wp:extent cx="5334000" cy="2299607"/>
             <wp:effectExtent b="0" l="0" r="0" t="0"/>
-            <wp:docPr descr="" title="" id="14" name="Picture"/>
+            <wp:docPr descr="" title="" id="16" name="Picture"/>
             <a:graphic>
               <a:graphicData uri="http://schemas.openxmlformats.org/drawingml/2006/picture">
                 <pic:pic>
                   <pic:nvPicPr>
-                    <pic:cNvPr descr="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" id="15" name="Picture"/>
+                    <pic:cNvPr descr="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" id="17" name="Picture"/>
                     <pic:cNvPicPr>
                       <a:picLocks noChangeArrowheads="1" noChangeAspect="1"/>
                     </pic:cNvPicPr>
                   </pic:nvPicPr>
                   <pic:blipFill>
-                    <a:blip r:embed="rId13"/>
+                    <a:blip r:embed="rId15"/>
                     <a:stretch>
                       <a:fillRect/>
                     </a:stretch>
@@ -569,8 +859,8 @@
         </w:drawing>
       </w:r>
     </w:p>
-    <w:bookmarkEnd w:id="16"/>
-    <w:bookmarkStart w:id="20" w:name="cycle-de-vie-dune-session"/>
+    <w:bookmarkEnd w:id="18"/>
+    <w:bookmarkStart w:id="22" w:name="cycle-de-vie-dune-session"/>
     <w:p>
       <w:pPr>
         <w:pStyle w:val="Heading3"/>
@@ -588,18 +878,18 @@
           <wp:inline>
             <wp:extent cx="5334000" cy="653722"/>
             <wp:effectExtent b="0" l="0" r="0" t="0"/>
-            <wp:docPr descr="" title="" id="18" name="Picture"/>
+            <wp:docPr descr="" title="" id="20" name="Picture"/>
             <a:graphic>
               <a:graphicData uri="http://schemas.openxmlformats.org/drawingml/2006/picture">
                 <pic:pic>
                   <pic:nvPicPr>
-                    <pic:cNvPr descr="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" id="19" name="Picture"/>
+                    <pic:cNvPr descr="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" id="21" name="Picture"/>
                     <pic:cNvPicPr>
                       <a:picLocks noChangeArrowheads="1" noChangeAspect="1"/>
                     </pic:cNvPicPr>
                   </pic:nvPicPr>
                   <pic:blipFill>
-                    <a:blip r:embed="rId17"/>
+                    <a:blip r:embed="rId19"/>
                     <a:stretch>
                       <a:fillRect/>
                     </a:stretch>
@@ -626,8 +916,8 @@
         </w:drawing>
       </w:r>
     </w:p>
-    <w:bookmarkEnd w:id="20"/>
-    <w:bookmarkStart w:id="24" w:name="use-cases"/>
+    <w:bookmarkEnd w:id="22"/>
+    <w:bookmarkStart w:id="26" w:name="use-cases"/>
     <w:p>
       <w:pPr>
         <w:pStyle w:val="Heading3"/>
@@ -645,18 +935,18 @@
           <wp:inline>
             <wp:extent cx="5334000" cy="3741964"/>
             <wp:effectExtent b="0" l="0" r="0" t="0"/>
-            <wp:docPr descr="" title="" id="22" name="Picture"/>
+            <wp:docPr descr="" title="" id="24" name="Picture"/>
             <a:graphic>
               <a:graphicData uri="http://schemas.openxmlformats.org/drawingml/2006/picture">
                 <pic:pic>
                   <pic:nvPicPr>
-                    <pic:cNvPr descr="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" id="23" name="Picture"/>
+                    <pic:cNvPr descr="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" id="25" name="Picture"/>
                     <pic:cNvPicPr>
                       <a:picLocks noChangeArrowheads="1" noChangeAspect="1"/>
                     </pic:cNvPicPr>
                   </pic:nvPicPr>
                   <pic:blipFill>
-                    <a:blip r:embed="rId21"/>
+                    <a:blip r:embed="rId23"/>
                     <a:stretch>
                       <a:fillRect/>
                     </a:stretch>
@@ -690,9 +980,9 @@
         </w:pict>
       </w:r>
     </w:p>
-    <w:bookmarkEnd w:id="24"/>
-    <w:bookmarkEnd w:id="25"/>
-    <w:bookmarkStart w:id="26" w:name="use-cases-1"/>
+    <w:bookmarkEnd w:id="26"/>
+    <w:bookmarkEnd w:id="27"/>
+    <w:bookmarkStart w:id="28" w:name="use-cases-1"/>
     <w:p>
       <w:pPr>
         <w:pStyle w:val="Heading2"/>
@@ -1062,8 +1352,8 @@
         </w:pict>
       </w:r>
     </w:p>
-    <w:bookmarkEnd w:id="26"/>
-    <w:bookmarkStart w:id="27" w:name="sources-de-données"/>
+    <w:bookmarkEnd w:id="28"/>
+    <w:bookmarkStart w:id="29" w:name="sources-de-données"/>
     <w:p>
       <w:pPr>
         <w:pStyle w:val="Heading2"/>
@@ -1372,8 +1662,8 @@
         </w:pict>
       </w:r>
     </w:p>
-    <w:bookmarkEnd w:id="27"/>
-    <w:bookmarkStart w:id="28" w:name="contraintes"/>
+    <w:bookmarkEnd w:id="29"/>
+    <w:bookmarkStart w:id="30" w:name="contraintes"/>
     <w:p>
       <w:pPr>
         <w:pStyle w:val="Heading2"/>
@@ -2124,8 +2414,8 @@
         </w:pict>
       </w:r>
     </w:p>
-    <w:bookmarkEnd w:id="28"/>
-    <w:bookmarkStart w:id="29" w:name="glossaire"/>
+    <w:bookmarkEnd w:id="30"/>
+    <w:bookmarkStart w:id="31" w:name="glossaire"/>
     <w:p>
       <w:pPr>
         <w:pStyle w:val="Heading2"/>
@@ -2505,8 +2795,8 @@
         </w:tc>
       </w:tr>
     </w:tbl>
-    <w:bookmarkEnd w:id="29"/>
-    <w:bookmarkEnd w:id="30"/>
+    <w:bookmarkEnd w:id="31"/>
+    <w:bookmarkEnd w:id="32"/>
     <w:sectPr>
       <w:footnotePr>
         <w:numRestart w:val="eachSect"/>
@@ -2702,10 +2992,146 @@
       </w:pPr>
     </w:lvl>
   </w:abstractNum>
+  <w:abstractNum w:abstractNumId="991">
+    <w:nsid w:val="0000A991"/>
+    <w:multiLevelType w:val="multilevel"/>
+    <w:lvl w:ilvl="0">
+      <w:numFmt w:val="bullet"/>
+      <w:lvlText w:val=""/>
+      <w:lvlJc w:val="left"/>
+      <w:pPr>
+        <w:ind w:left="720" w:hanging="360"/>
+      </w:pPr>
+      <w:rPr>
+        <w:rFonts w:ascii="Symbol" w:hAnsi="Symbol" w:cs="Symbol" w:hint="default"/>
+      </w:rPr>
+    </w:lvl>
+    <w:lvl w:ilvl="1">
+      <w:numFmt w:val="bullet"/>
+      <w:lvlText w:val="o"/>
+      <w:lvlJc w:val="left"/>
+      <w:pPr>
+        <w:ind w:left="1440" w:hanging="360"/>
+      </w:pPr>
+      <w:rPr>
+        <w:rFonts w:ascii="Courier New" w:hAnsi="Courier New" w:cs="Courier New" w:hint="default"/>
+      </w:rPr>
+    </w:lvl>
+    <w:lvl w:ilvl="2">
+      <w:numFmt w:val="bullet"/>
+      <w:lvlText w:val=""/>
+      <w:lvlJc w:val="left"/>
+      <w:pPr>
+        <w:ind w:left="2160" w:hanging="360"/>
+      </w:pPr>
+      <w:rPr>
+        <w:rFonts w:ascii="Wingdings" w:hAnsi="Wingdings" w:cs="Wingdings" w:hint="default"/>
+      </w:rPr>
+    </w:lvl>
+    <w:lvl w:ilvl="3">
+      <w:numFmt w:val="bullet"/>
+      <w:lvlText w:val=""/>
+      <w:lvlJc w:val="left"/>
+      <w:pPr>
+        <w:ind w:left="2880" w:hanging="360"/>
+      </w:pPr>
+      <w:rPr>
+        <w:rFonts w:ascii="Symbol" w:hAnsi="Symbol" w:cs="Symbol" w:hint="default"/>
+      </w:rPr>
+    </w:lvl>
+    <w:lvl w:ilvl="4">
+      <w:numFmt w:val="bullet"/>
+      <w:lvlText w:val="o"/>
+      <w:lvlJc w:val="left"/>
+      <w:pPr>
+        <w:ind w:left="3600" w:hanging="360"/>
+      </w:pPr>
+      <w:rPr>
+        <w:rFonts w:ascii="Courier New" w:hAnsi="Courier New" w:cs="Courier New" w:hint="default"/>
+      </w:rPr>
+    </w:lvl>
+    <w:lvl w:ilvl="5">
+      <w:numFmt w:val="bullet"/>
+      <w:lvlText w:val=""/>
+      <w:lvlJc w:val="left"/>
+      <w:pPr>
+        <w:ind w:left="4320" w:hanging="360"/>
+      </w:pPr>
+      <w:rPr>
+        <w:rFonts w:ascii="Wingdings" w:hAnsi="Wingdings" w:cs="Wingdings" w:hint="default"/>
+      </w:rPr>
+    </w:lvl>
+    <w:lvl w:ilvl="6">
+      <w:numFmt w:val="bullet"/>
+      <w:lvlText w:val=""/>
+      <w:lvlJc w:val="left"/>
+      <w:pPr>
+        <w:ind w:left="5040" w:hanging="360"/>
+      </w:pPr>
+      <w:rPr>
+        <w:rFonts w:ascii="Symbol" w:hAnsi="Symbol" w:cs="Symbol" w:hint="default"/>
+      </w:rPr>
+    </w:lvl>
+    <w:lvl w:ilvl="7">
+      <w:numFmt w:val="bullet"/>
+      <w:lvlText w:val="o"/>
+      <w:lvlJc w:val="left"/>
+      <w:pPr>
+        <w:ind w:left="5760" w:hanging="360"/>
+      </w:pPr>
+      <w:rPr>
+        <w:rFonts w:ascii="Courier New" w:hAnsi="Courier New" w:cs="Courier New" w:hint="default"/>
+      </w:rPr>
+    </w:lvl>
+    <w:lvl w:ilvl="8">
+      <w:numFmt w:val="bullet"/>
+      <w:lvlText w:val=""/>
+      <w:lvlJc w:val="left"/>
+      <w:pPr>
+        <w:ind w:left="6480" w:hanging="360"/>
+      </w:pPr>
+      <w:rPr>
+        <w:rFonts w:ascii="Wingdings" w:hAnsi="Wingdings" w:cs="Wingdings" w:hint="default"/>
+      </w:rPr>
+    </w:lvl>
+  </w:abstractNum>
   <w:num w:numId="1000">
     <w:abstractNumId w:val="990"/>
   </w:num>
   <w:num w:numId="1001">
+    <w:abstractNumId w:val="99411"/>
+    <w:lvlOverride w:ilvl="0">
+      <w:startOverride w:val="1"/>
+    </w:lvlOverride>
+    <w:lvlOverride w:ilvl="1">
+      <w:startOverride w:val="1"/>
+    </w:lvlOverride>
+    <w:lvlOverride w:ilvl="2">
+      <w:startOverride w:val="1"/>
+    </w:lvlOverride>
+    <w:lvlOverride w:ilvl="3">
+      <w:startOverride w:val="1"/>
+    </w:lvlOverride>
+    <w:lvlOverride w:ilvl="4">
+      <w:startOverride w:val="1"/>
+    </w:lvlOverride>
+    <w:lvlOverride w:ilvl="5">
+      <w:startOverride w:val="1"/>
+    </w:lvlOverride>
+    <w:lvlOverride w:ilvl="6">
+      <w:startOverride w:val="1"/>
+    </w:lvlOverride>
+    <w:lvlOverride w:ilvl="7">
+      <w:startOverride w:val="1"/>
+    </w:lvlOverride>
+    <w:lvlOverride w:ilvl="8">
+      <w:startOverride w:val="1"/>
+    </w:lvlOverride>
+  </w:num>
+  <w:num w:numId="1002">
+    <w:abstractNumId w:val="991"/>
+  </w:num>
+  <w:num w:numId="1003">
     <w:abstractNumId w:val="99411"/>
     <w:lvlOverride w:ilvl="0">
       <w:startOverride w:val="1"/>

</xml_diff>

<commit_message>
docs: clarify modes diagram with composite states
Replace flat stateDiagram with nested states showing Mode Contexte
(discussion guidée, aucune exécution) and Mode Analyse (code exécuté,
rapport statique) as distinct visual zones.

Co-Authored-By: Claude Sonnet 4.6 <noreply@anthropic.com>
</commit_message>
<xml_diff>
--- a/docs/PRD_IDEA_copepod.docx
+++ b/docs/PRD_IDEA_copepod.docx
@@ -205,7 +205,7 @@
         <w:pStyle w:val="FirstParagraph"/>
       </w:pPr>
       <w:r>
-        <w:t xml:space="preserve">Ce document décrit les exigences produit de l’assistant graphique copépodes — un profil de la plateforme IDEA (Université d’Hawaii) adapté aux données marines de NeoLab (Université Laval).</w:t>
+        <w:t xml:space="preserve">Ce document décrit les exigences produit de l’assistant graphique copépodes — une readaptation de la plateforme IDEA (Université d’Hawaii) adaptée aux besoins du laboratoire NeoLab (Université Laval).</w:t>
       </w:r>
     </w:p>
     <w:p>
@@ -214,41 +214,6 @@
       </w:pPr>
       <w:r>
         <w:t xml:space="preserve">Il s’adresse aux chercheurs NeoLab qui utiliseront l’outil, aux développeurs qui l’implémentent, et à toute personne qui veut comprendre ce que l’assistant fait, pour qui, et selon quelles règles.</w:t>
-      </w:r>
-    </w:p>
-    <w:p>
-      <w:pPr>
-        <w:pStyle w:val="BodyText"/>
-      </w:pPr>
-      <w:r>
-        <w:t xml:space="preserve">Il ne décrit pas comment le système est construit techniquement — pour ça, voir</w:t>
-      </w:r>
-      <w:r>
-        <w:t xml:space="preserve"> </w:t>
-      </w:r>
-      <w:r>
-        <w:rPr>
-          <w:rStyle w:val="VerbatimChar"/>
-        </w:rPr>
-        <w:t xml:space="preserve">ARCHITECTURE.md</w:t>
-      </w:r>
-      <w:r>
-        <w:t xml:space="preserve"> </w:t>
-      </w:r>
-      <w:r>
-        <w:t xml:space="preserve">et</w:t>
-      </w:r>
-      <w:r>
-        <w:t xml:space="preserve"> </w:t>
-      </w:r>
-      <w:r>
-        <w:rPr>
-          <w:rStyle w:val="VerbatimChar"/>
-        </w:rPr>
-        <w:t xml:space="preserve">docs/adr/</w:t>
-      </w:r>
-      <w:r>
-        <w:t xml:space="preserve">.</w:t>
       </w:r>
     </w:p>
     <w:p>
@@ -493,8 +458,7 @@
     <w:tbl>
       <w:tblPr>
         <w:tblStyle w:val="Table"/>
-        <w:tblW w:type="pct" w:w="5000"/>
-        <w:tblLayout w:type="fixed"/>
+        <w:tblW w:type="auto" w:w="0"/>
         <w:tblLook w:firstRow="1" w:lastRow="0" w:firstColumn="0" w:lastColumn="0" w:noHBand="0" w:noVBand="0" w:val="0020"/>
       </w:tblPr>
       <w:tblGrid>
@@ -575,41 +539,6 @@
           </w:p>
         </w:tc>
       </w:tr>
-      <w:tr>
-        <w:tc>
-          <w:tcPr/>
-          <w:p>
-            <w:pPr>
-              <w:pStyle w:val="Compact"/>
-            </w:pPr>
-            <w:r>
-              <w:t xml:space="preserve">1.1</w:t>
-            </w:r>
-          </w:p>
-        </w:tc>
-        <w:tc>
-          <w:tcPr/>
-          <w:p>
-            <w:pPr>
-              <w:pStyle w:val="Compact"/>
-            </w:pPr>
-            <w:r>
-              <w:t xml:space="preserve">2026-05-25</w:t>
-            </w:r>
-          </w:p>
-        </w:tc>
-        <w:tc>
-          <w:tcPr/>
-          <w:p>
-            <w:pPr>
-              <w:pStyle w:val="Compact"/>
-            </w:pPr>
-            <w:r>
-              <w:t xml:space="preserve">Recentrage sur le problème réel après session grill-with-docs</w:t>
-            </w:r>
-          </w:p>
-        </w:tc>
-      </w:tr>
     </w:tbl>
     <w:p>
       <w:r>
@@ -633,7 +562,13 @@
         <w:pStyle w:val="FirstParagraph"/>
       </w:pPr>
       <w:r>
-        <w:t xml:space="preserve">Générer un graphique depuis les données copépodes NeoLab prend trop de temps. Les deux frictions principales sont écrire le code de visualisation et manipuler les données (comprendre les colonnes, joindre les sources, nettoyer). Ce n’est pas une question de compétence — les chercheurs savent coder — c’est une question d’efficacité.</w:t>
+        <w:t xml:space="preserve">Générer des graphiques depuis les données copépodes NeoLab peut prendre du temps en raison des nombreuses données historiques possédées par le laboratoire.</w:t>
+      </w:r>
+      <w:r>
+        <w:t xml:space="preserve"> </w:t>
+      </w:r>
+      <w:r>
+        <w:t xml:space="preserve">Le processus de création de graphiques implique plusieurs étapes, chacune pouvant être source de friction.</w:t>
       </w:r>
     </w:p>
     <w:p>
@@ -674,7 +609,7 @@
         <w:t xml:space="preserve"> </w:t>
       </w:r>
       <w:r>
-        <w:t xml:space="preserve">(Université d’Hawaii) aux données NeoLab. Trois choses changent :</w:t>
+        <w:t xml:space="preserve">(Université d’Hawaii) aux besoins de NeoLab. Trois choses changent :</w:t>
       </w:r>
     </w:p>
     <w:p>
@@ -712,13 +647,13 @@
           <w:b/>
           <w:bCs/>
         </w:rPr>
-        <w:t xml:space="preserve">Les outils</w:t>
+        <w:t xml:space="preserve">Le contexte d’utilisation</w:t>
       </w:r>
       <w:r>
         <w:t xml:space="preserve"> </w:t>
       </w:r>
       <w:r>
-        <w:t xml:space="preserve">— manipulation des données et génération de graphiques pour EcoTaxa, EcoPart, Amundsen CTD, OGSL, Bio-ORACLE et fichiers labo</w:t>
+        <w:t xml:space="preserve">— Usage dans un contexte de recherche scientifique donc plus de précision dans les réponses</w:t>
       </w:r>
     </w:p>
     <w:p>
@@ -734,13 +669,35 @@
           <w:b/>
           <w:bCs/>
         </w:rPr>
+        <w:t xml:space="preserve">Les outils</w:t>
+      </w:r>
+      <w:r>
+        <w:t xml:space="preserve"> </w:t>
+      </w:r>
+      <w:r>
+        <w:t xml:space="preserve">— manipulation des données et génération de graphiques pour EcoTaxa, EcoPart, Amundsen CTD, OGSL, Bio-ORACLE et fichiers labo</w:t>
+      </w:r>
+    </w:p>
+    <w:p>
+      <w:pPr>
+        <w:pStyle w:val="Compact"/>
+        <w:numPr>
+          <w:ilvl w:val="0"/>
+          <w:numId w:val="1003"/>
+        </w:numPr>
+      </w:pPr>
+      <w:r>
+        <w:rPr>
+          <w:b/>
+          <w:bCs/>
+        </w:rPr>
         <w:t xml:space="preserve">La documentation</w:t>
       </w:r>
       <w:r>
         <w:t xml:space="preserve"> </w:t>
       </w:r>
       <w:r>
-        <w:t xml:space="preserve">— corpus RAG de 5 documents copépodes</w:t>
+        <w:t xml:space="preserve">— La documentation que l’agent va devoir utiliser</w:t>
       </w:r>
     </w:p>
     <w:p>
@@ -783,7 +740,15 @@
         <w:t xml:space="preserve"> </w:t>
       </w:r>
       <w:r>
-        <w:t xml:space="preserve">— professeur ou étudiant de NeoLab (Université Laval) qui travaille avec des données de copépodes marins. Aucune fonctionnalité n’est réservée à l’un ou l’autre.</w:t>
+        <w:t xml:space="preserve">— professeur ou étudiant de NeoLab (Université Laval) qui travaille avec des données de copépodes.</w:t>
+      </w:r>
+    </w:p>
+    <w:p>
+      <w:pPr>
+        <w:pStyle w:val="BodyText"/>
+      </w:pPr>
+      <w:r>
+        <w:t xml:space="preserve">Aucune fonctionnalité n’est réservée à l’un ou l’autre même s’ils auraient des utilisations différentes.</w:t>
       </w:r>
     </w:p>
     <w:p>
@@ -819,14 +784,14 @@
       <w:r>
         <w:drawing>
           <wp:inline>
-            <wp:extent cx="5334000" cy="2299607"/>
+            <wp:extent cx="5334000" cy="10093569"/>
             <wp:effectExtent b="0" l="0" r="0" t="0"/>
             <wp:docPr descr="" title="" id="16" name="Picture"/>
             <a:graphic>
               <a:graphicData uri="http://schemas.openxmlformats.org/drawingml/2006/picture">
                 <pic:pic>
                   <pic:nvPicPr>
-                    <pic:cNvPr descr="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" id="17" name="Picture"/>
+                    <pic:cNvPr descr="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" id="17" name="Picture"/>
                     <pic:cNvPicPr>
                       <a:picLocks noChangeArrowheads="1" noChangeAspect="1"/>
                     </pic:cNvPicPr>
@@ -840,7 +805,7 @@
                   <pic:spPr bwMode="auto">
                     <a:xfrm>
                       <a:off x="0" y="0"/>
-                      <a:ext cx="5334000" cy="2299607"/>
+                      <a:ext cx="5334000" cy="10093569"/>
                     </a:xfrm>
                     <a:prstGeom prst="rect">
                       <a:avLst/>

</xml_diff>

<commit_message>
docs: fix session lifecycle diagram — charger → contexte → valider → graphiques → livrable
Co-Authored-By: Claude Sonnet 4.6 <noreply@anthropic.com>
</commit_message>
<xml_diff>
--- a/docs/PRD_IDEA_copepod.docx
+++ b/docs/PRD_IDEA_copepod.docx
@@ -841,14 +841,14 @@
       <w:r>
         <w:drawing>
           <wp:inline>
-            <wp:extent cx="5334000" cy="653722"/>
+            <wp:extent cx="5334000" cy="469446"/>
             <wp:effectExtent b="0" l="0" r="0" t="0"/>
             <wp:docPr descr="" title="" id="20" name="Picture"/>
             <a:graphic>
               <a:graphicData uri="http://schemas.openxmlformats.org/drawingml/2006/picture">
                 <pic:pic>
                   <pic:nvPicPr>
-                    <pic:cNvPr descr="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" id="21" name="Picture"/>
+                    <pic:cNvPr descr="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" id="21" name="Picture"/>
                     <pic:cNvPicPr>
                       <a:picLocks noChangeArrowheads="1" noChangeAspect="1"/>
                     </pic:cNvPicPr>
@@ -862,7 +862,7 @@
                   <pic:spPr bwMode="auto">
                     <a:xfrm>
                       <a:off x="0" y="0"/>
-                      <a:ext cx="5334000" cy="653722"/>
+                      <a:ext cx="5334000" cy="469446"/>
                     </a:xfrm>
                     <a:prstGeom prst="rect">
                       <a:avLst/>

</xml_diff>

<commit_message>
docs: extend lifecycle — agent inspecte données + étape génération artefact
Co-Authored-By: Claude Sonnet 4.6 <noreply@anthropic.com>
</commit_message>
<xml_diff>
--- a/docs/PRD_IDEA_copepod.docx
+++ b/docs/PRD_IDEA_copepod.docx
@@ -841,14 +841,14 @@
       <w:r>
         <w:drawing>
           <wp:inline>
-            <wp:extent cx="5334000" cy="469446"/>
+            <wp:extent cx="5334000" cy="340178"/>
             <wp:effectExtent b="0" l="0" r="0" t="0"/>
             <wp:docPr descr="" title="" id="20" name="Picture"/>
             <a:graphic>
               <a:graphicData uri="http://schemas.openxmlformats.org/drawingml/2006/picture">
                 <pic:pic>
                   <pic:nvPicPr>
-                    <pic:cNvPr descr="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" id="21" name="Picture"/>
+                    <pic:cNvPr descr="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" id="21" name="Picture"/>
                     <pic:cNvPicPr>
                       <a:picLocks noChangeArrowheads="1" noChangeAspect="1"/>
                     </pic:cNvPicPr>
@@ -862,7 +862,7 @@
                   <pic:spPr bwMode="auto">
                     <a:xfrm>
                       <a:off x="0" y="0"/>
-                      <a:ext cx="5334000" cy="469446"/>
+                      <a:ext cx="5334000" cy="340178"/>
                     </a:xfrm>
                     <a:prstGeom prst="rect">
                       <a:avLst/>
@@ -2659,34 +2659,6 @@
                 <w:b/>
                 <w:bCs/>
               </w:rPr>
-              <w:t xml:space="preserve">ind/m³</w:t>
-            </w:r>
-          </w:p>
-        </w:tc>
-        <w:tc>
-          <w:tcPr/>
-          <w:p>
-            <w:pPr>
-              <w:pStyle w:val="Compact"/>
-            </w:pPr>
-            <w:r>
-              <w:t xml:space="preserve">Individus par mètre cube — unité de concentration standard pour le zooplancton.</w:t>
-            </w:r>
-          </w:p>
-        </w:tc>
-      </w:tr>
-      <w:tr>
-        <w:tc>
-          <w:tcPr/>
-          <w:p>
-            <w:pPr>
-              <w:pStyle w:val="Compact"/>
-            </w:pPr>
-            <w:r>
-              <w:rPr>
-                <w:b/>
-                <w:bCs/>
-              </w:rPr>
               <w:t xml:space="preserve">Corpus RAG</w:t>
             </w:r>
           </w:p>
@@ -2726,7 +2698,7 @@
               <w:pStyle w:val="Compact"/>
             </w:pPr>
             <w:r>
-              <w:t xml:space="preserve">État de session dans lequel une source externe est activée. Activé source par source.</w:t>
+              <w:t xml:space="preserve">État de session dans lequel une source externe est activée.</w:t>
             </w:r>
           </w:p>
         </w:tc>

</xml_diff>

<commit_message>
docs: add chargement + inspection steps to Mode Contexte diagram
Co-Authored-By: Claude Sonnet 4.6 <noreply@anthropic.com>
</commit_message>
<xml_diff>
--- a/docs/PRD_IDEA_copepod.docx
+++ b/docs/PRD_IDEA_copepod.docx
@@ -784,14 +784,14 @@
       <w:r>
         <w:drawing>
           <wp:inline>
-            <wp:extent cx="5334000" cy="10093569"/>
+            <wp:extent cx="5334000" cy="12206653"/>
             <wp:effectExtent b="0" l="0" r="0" t="0"/>
             <wp:docPr descr="" title="" id="16" name="Picture"/>
             <a:graphic>
               <a:graphicData uri="http://schemas.openxmlformats.org/drawingml/2006/picture">
                 <pic:pic>
                   <pic:nvPicPr>
-                    <pic:cNvPr descr="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" id="17" name="Picture"/>
+                    <pic:cNvPr descr="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" id="17" name="Picture"/>
                     <pic:cNvPicPr>
                       <a:picLocks noChangeArrowheads="1" noChangeAspect="1"/>
                     </pic:cNvPicPr>
@@ -805,7 +805,7 @@
                   <pic:spPr bwMode="auto">
                     <a:xfrm>
                       <a:off x="0" y="0"/>
-                      <a:ext cx="5334000" cy="10093569"/>
+                      <a:ext cx="5334000" cy="12206653"/>
                     </a:xfrm>
                     <a:prstGeom prst="rect">
                       <a:avLst/>

</xml_diff>

<commit_message>
docs: sync DOCX with latest PRD edits — modes, lifecycle, solution bullet 5
Co-Authored-By: Claude Sonnet 4.6 <noreply@anthropic.com>
</commit_message>
<xml_diff>
--- a/docs/PRD_IDEA_copepod.docx
+++ b/docs/PRD_IDEA_copepod.docx
@@ -213,7 +213,7 @@
         <w:pStyle w:val="BodyText"/>
       </w:pPr>
       <w:r>
-        <w:t xml:space="preserve">Il s’adresse aux chercheurs NeoLab qui utiliseront l’outil, aux développeurs qui l’implémentent, et à toute personne qui veut comprendre ce que l’assistant fait, pour qui, et selon quelles règles.</w:t>
+        <w:t xml:space="preserve">Il s’adresse à toute personne qui veut comprendre ce que l’assistant fait, pour qui, et selon quelles règles.</w:t>
       </w:r>
     </w:p>
     <w:p>
@@ -562,11 +562,13 @@
         <w:pStyle w:val="FirstParagraph"/>
       </w:pPr>
       <w:r>
-        <w:t xml:space="preserve">Générer des graphiques depuis les données copépodes NeoLab peut prendre du temps en raison des nombreuses données historiques possédées par le laboratoire.</w:t>
-      </w:r>
-      <w:r>
-        <w:t xml:space="preserve"> </w:t>
-      </w:r>
+        <w:t xml:space="preserve">L’analyse exploratoire faites par le laboratoire NeoLab peut prendre du temps en raison des nombreuses données historiques possédées par le laboratoire.</w:t>
+      </w:r>
+    </w:p>
+    <w:p>
+      <w:pPr>
+        <w:pStyle w:val="BodyText"/>
+      </w:pPr>
       <w:r>
         <w:t xml:space="preserve">Le processus de création de graphiques implique plusieurs étapes, chacune pouvant être source de friction.</w:t>
       </w:r>
@@ -609,12 +611,11 @@
         <w:t xml:space="preserve"> </w:t>
       </w:r>
       <w:r>
-        <w:t xml:space="preserve">(Université d’Hawaii) aux besoins de NeoLab. Trois choses changent :</w:t>
-      </w:r>
-    </w:p>
-    <w:p>
-      <w:pPr>
-        <w:pStyle w:val="Compact"/>
+        <w:t xml:space="preserve">(Université d’Hawaii) aux besoins de NeoLab. Plusieurs choses changent :</w:t>
+      </w:r>
+    </w:p>
+    <w:p>
+      <w:pPr>
         <w:numPr>
           <w:ilvl w:val="0"/>
           <w:numId w:val="1003"/>
@@ -636,7 +637,6 @@
     </w:p>
     <w:p>
       <w:pPr>
-        <w:pStyle w:val="Compact"/>
         <w:numPr>
           <w:ilvl w:val="0"/>
           <w:numId w:val="1003"/>
@@ -658,7 +658,6 @@
     </w:p>
     <w:p>
       <w:pPr>
-        <w:pStyle w:val="Compact"/>
         <w:numPr>
           <w:ilvl w:val="0"/>
           <w:numId w:val="1003"/>
@@ -680,7 +679,6 @@
     </w:p>
     <w:p>
       <w:pPr>
-        <w:pStyle w:val="Compact"/>
         <w:numPr>
           <w:ilvl w:val="0"/>
           <w:numId w:val="1003"/>
@@ -702,10 +700,23 @@
     </w:p>
     <w:p>
       <w:pPr>
-        <w:pStyle w:val="FirstParagraph"/>
-      </w:pPr>
-      <w:r>
-        <w:t xml:space="preserve">Le runtime IDEA (exécution de code, gestion de fichiers, export d’artefacts) est conservé tel quel.</w:t>
+        <w:numPr>
+          <w:ilvl w:val="0"/>
+          <w:numId w:val="1003"/>
+        </w:numPr>
+      </w:pPr>
+      <w:r>
+        <w:rPr>
+          <w:b/>
+          <w:bCs/>
+        </w:rPr>
+        <w:t xml:space="preserve">L’interface utilisateur</w:t>
+      </w:r>
+      <w:r>
+        <w:t xml:space="preserve"> </w:t>
+      </w:r>
+      <w:r>
+        <w:t xml:space="preserve">— L’interface doit être adaptée pour faciliter l’interaction avec les données et les graphiques</w:t>
       </w:r>
     </w:p>
     <w:p>
@@ -947,13 +958,13 @@
     </w:p>
     <w:bookmarkEnd w:id="26"/>
     <w:bookmarkEnd w:id="27"/>
-    <w:bookmarkStart w:id="28" w:name="use-cases-1"/>
+    <w:bookmarkStart w:id="28" w:name="use-cases-détaillés"/>
     <w:p>
       <w:pPr>
         <w:pStyle w:val="Heading2"/>
       </w:pPr>
       <w:r>
-        <w:t xml:space="preserve">5. Use Cases</w:t>
+        <w:t xml:space="preserve">5. Use Cases détaillés</w:t>
       </w:r>
     </w:p>
     <w:p>
@@ -1613,14 +1624,6 @@
       </w:tr>
     </w:tbl>
     <w:p>
-      <w:pPr>
-        <w:pStyle w:val="BlockText"/>
-      </w:pPr>
-      <w:r>
-        <w:t xml:space="preserve">Chaque source est activée explicitement. L’assistant n’utilise jamais une source non chargée ou non activée. Les project IDs EcoTaxa/EcoPart sont découverts dynamiquement — jamais codés en dur.</w:t>
-      </w:r>
-    </w:p>
-    <w:p>
       <w:r>
         <w:pict>
           <v:rect style="width:0;height:1.5pt" o:hralign="center" o:hrstd="t" o:hr="t"/>
@@ -2563,58 +2566,6 @@
             </w:pPr>
             <w:r>
               <w:t xml:space="preserve">Conductivity-Temperature-Depth. Instrument de mesure des propriétés physiques de l’eau.</w:t>
-            </w:r>
-          </w:p>
-        </w:tc>
-      </w:tr>
-      <w:tr>
-        <w:tc>
-          <w:tcPr/>
-          <w:p>
-            <w:pPr>
-              <w:pStyle w:val="Compact"/>
-            </w:pPr>
-            <w:r>
-              <w:rPr>
-                <w:b/>
-                <w:bCs/>
-              </w:rPr>
-              <w:t xml:space="preserve">obj_orig_id</w:t>
-            </w:r>
-          </w:p>
-        </w:tc>
-        <w:tc>
-          <w:tcPr/>
-          <w:p>
-            <w:pPr>
-              <w:pStyle w:val="Compact"/>
-            </w:pPr>
-            <w:r>
-              <w:t xml:space="preserve">Identifiant d’objet EcoTaxa. Clé de jointure vers le profil EcoPart (</w:t>
-            </w:r>
-            <w:r>
-              <w:rPr>
-                <w:rStyle w:val="VerbatimChar"/>
-              </w:rPr>
-              <w:t xml:space="preserve">ips_007_899</w:t>
-            </w:r>
-            <w:r>
-              <w:t xml:space="preserve"> </w:t>
-            </w:r>
-            <w:r>
-              <w:t xml:space="preserve">→</w:t>
-            </w:r>
-            <w:r>
-              <w:t xml:space="preserve"> </w:t>
-            </w:r>
-            <w:r>
-              <w:rPr>
-                <w:rStyle w:val="VerbatimChar"/>
-              </w:rPr>
-              <w:t xml:space="preserve">ips_007</w:t>
-            </w:r>
-            <w:r>
-              <w:t xml:space="preserve">).</w:t>
             </w:r>
           </w:p>
         </w:tc>

</xml_diff>